<commit_message>
fix(review-3): reconcile Sepolia deployment, EVM opcode gas, clean benchmark, IEEE PDF layout, and verified citations
</commit_message>
<xml_diff>
--- a/submission_materials/2_Research_Paper_Source/IEEE_BAMKS_D_Research_Paper.docx
+++ b/submission_materials/2_Research_Paper_Source/IEEE_BAMKS_D_Research_Paper.docx
@@ -85,7 +85,7 @@
                 <w:color w:val="334155"/>
                 <w:sz w:val="19"/>
               </w:rPr>
-              <w:t>In cloud-edge IoT architectures for healthcare, sharing encrypted Electronic Health Records (EHR) demands fine-grained access control, conjunctive keyword search, and verifiable query results. The BAMKS scheme (Cheng et al., Internet of Things, 2026) addressed multi-authority access control and blockchain result verification, yet its index update mechanism requires either re-indexing the entire collection or executing O(L * m) group updates across all existing documents. In this paper, we present BAMKS-D, an algorithmic prototype and architecture integration layer that introduces atomic file-level operations. Single-document addition operates in strict O(m) time, achieving a 12.11x speedup at L=5,000 files over Cheng et al. Section 5.10 index updates (and 3,527.7x over naive full re-encryption). Single-document revocation is mapped directly to Ethereum Virtual Machine (EVM) storage (mapping(uint256 =&gt; bool) deletedDocRegistry), achieving O(1) constant-time lookup with zero array traversal. We validate the architecture through live smart contract deployment on the Ethereum Sepolia Testnet (0xfDC8615Bf6483c3B0f39c330F55A56Cb0f08C8D3), decentralized IPFS storage, and a 30-run empirical benchmark (m=3). An honest assessment of prototype algebraic assumptions, inverted index access-pattern leakage, and threats to validity is presented.</w:t>
+              <w:t>In cloud-edge IoT architectures for healthcare, sharing encrypted Electronic Health Records (EHR) demands fine-grained access control, conjunctive keyword search, and verifiable query results. The BAMKS scheme (Cheng et al., Internet of Things, 2026) addressed multi-authority access control and blockchain result verification, yet its index update mechanism requires either re-indexing the entire collection or executing O(L * m) group updates across all existing documents. In this paper, we present BAMKS-D, an algorithmic prototype and architecture integration layer that introduces atomic file-level operations. Single-document addition operates in strict O(m) time, achieving a 5.27x speedup for pure index operations at L=5,000 files over Cheng et al. Section 5.10 updates (and 724.0x over naive full re-encryption). For like-for-like end-to-end file addition, BAMKS-D achieves a 5.46x speedup over Cheng et al. Single-document revocation is mapped directly to Ethereum Virtual Machine (EVM) storage (mapping(uint256 =&gt; bool) deletedDocRegistry), achieving O(1) constant-time lookup with zero array traversal on the deletion path. We validate the architecture through smart contract deployment on Ethereum Sepolia (0x17b09aad051BcD92EcfF3F08d87B1b333287cB1F), decentralized IPFS storage, and 30-run empirical benchmarks (m=3). An honest assessment of prototype algebraic assumptions, inverted index access-pattern leakage, and threats to validity is presented.</w:t>
               <w:br/>
               <w:br/>
               <w:t>Keywords: Searchable Encryption, Attribute-Based Encryption, Blockchain, Smart Contracts, Dynamic Revocation, Healthcare IoT, EVM.</w:t>
@@ -137,7 +137,7 @@
           <w:rFonts w:ascii="Times New Roman" w:hAnsi="Times New Roman"/>
           <w:sz w:val="20"/>
         </w:rPr>
-        <w:t>To reconcile cryptographic confidentiality with expressive querying, Ciphertext-Policy Attribute-Based Keyword Search (CP-ABKS) schemes were formulated [5], [6]. In CP-ABKS, data owners encrypt documents under an access structure (e.g., (Role_Doctor and Dept_Cardiology)), and only clinicians with valid attribute credentials can generate search trapdoors or decrypt returned records [7], [8]. Recently, Cheng et al. [1] proposed BAMKS, introducing decentralized multi-authority key generation, multi-owner collaborative indexing, and a blockchain Result Verification Smart Contract (RVSC) utilizing aggregated Schnorr Non-Interactive Zero-Knowledge (SNIZK) proofs [11].</w:t>
+        <w:t>To reconcile cryptographic confidentiality with expressive querying, Ciphertext-Policy Attribute-Based Keyword Search (CP-ABKS) schemes were formulated, originating from verifiable attribute-based search by Zheng et al. [6] building upon foundational searchable encryption by Boneh et al. [7] and CP-ABE by Bethencourt et al. [8]. In CP-ABKS, data owners encrypt documents under an access structure (e.g., (Role_Doctor and Dept_Cardiology)), and only clinicians with valid attribute credentials can generate search trapdoors or decrypt returned records [9], [10], [11]. Advanced variants introduced non-monotonic policies [12], multi-authority decentralized key generation [13], [14], predicate evaluations [15], and dynamic broadcast structures [21]. Recently, Cheng et al. [1] proposed BAMKS, introducing decentralized multi-authority key generation, multi-owner collaborative indexing, and a blockchain Result Verification Smart Contract (RVSC) utilizing aggregated Schnorr Non-Interactive Zero-Knowledge (SNIZK) proofs [16].</w:t>
       </w:r>
     </w:p>
     <w:p>
@@ -150,7 +150,7 @@
           <w:rFonts w:ascii="Times New Roman" w:hAnsi="Times New Roman"/>
           <w:sz w:val="20"/>
         </w:rPr>
-        <w:t>The Open Challenge in BAMKS: In Section 8 of their foundational paper, Cheng et al. identified a critical operational bottleneck [1]: their architecture supports dynamic user credential updates, but does not provide an efficient mechanism for single-file additions or deletions. Adding a single document requires either re-encrypting and re-indexing the entire document collection (naive baseline), or updating the entire inverted index via modular multiplication of an update token X_upd across all L * m index entries (Section 5.10 baseline) [1]. For an enterprise healthcare repository with L = 5,000 records and m = 3 keywords, updating 15,000 index entries introduces noticeable latency. Furthermore, document deletion in prior schemes requires either re-encrypting the remaining corpus or relying on cloud server honesty.</w:t>
+        <w:t>The Open Challenge in BAMKS: In Section 8 of their foundational paper, Cheng et al. identified a critical operational bottleneck [1]: their architecture supports dynamic user credential updates, but does not define an efficient mechanism for single-file additions or deletions. Adding a single document requires either re-encrypting and re-indexing the entire document collection (naive baseline), or updating the entire inverted index via modular multiplication of an update token X_upd across all L * m index entries (Section 5.10 baseline) [1]. For an enterprise healthcare repository with L = 5,000 records and m = 3 keywords, updating 15,000 index entries introduces noticeable latency. Furthermore, document deletion was not defined in Cheng et al. [1], forcing reliance on full corpus re-encryption (O(L * m) assumption) or cloud server honesty.</w:t>
       </w:r>
     </w:p>
     <w:p>
@@ -167,11 +167,11 @@
         <w:br/>
         <w:t>• Atomic Single-Document Addition (O(m)): Decouples inverted keyword indexing so appending an EHR requires generating tokens only for its m keywords.</w:t>
         <w:br/>
-        <w:t>• Instant On-Chain Document Revocation (O(1)): Employs EVM direct mapping storage with zero array traversal.</w:t>
+        <w:t>• Instant On-Chain Document Revocation (O(1)): Employs EVM direct mapping storage (deletedDocRegistry) with zero array traversal on the deletion path.</w:t>
         <w:br/>
-        <w:t>• Live Ethereum Sepolia Deployment: Verified BAMKS_Registry.sol contract (0xfDC8615Bf6483c3B0f39c330F55A56Cb0f08C8D3) with mined receipts.</w:t>
+        <w:t>• Live Ethereum Sepolia Deployment: Deployed BAMKS_Registry.sol contract on Ethereum Sepolia (0x17b09aad051BcD92EcfF3F08d87B1b333287cB1F) with mined receipts.</w:t>
         <w:br/>
-        <w:t>• Rigorous Fair Benchmarks (30 Runs): Evaluates both naive re-encryption and true Cheng et al. Section 5.10 index updates on an Intel Core i5-13420H platform.</w:t>
+        <w:t>• Rigorous Fair Benchmarks (30 Runs): Evaluates both naive re-encryption and true Cheng et al. Section 5.10 index updates without warm-up anomalies, demonstrating a 5.27x speedup for pure index updates and 5.46x for like-for-like full file additions at L=5,000 files on an Intel Core i5-13420H platform.</w:t>
       </w:r>
     </w:p>
     <w:p>
@@ -199,20 +199,7 @@
           <w:rFonts w:ascii="Times New Roman" w:hAnsi="Times New Roman"/>
           <w:sz w:val="20"/>
         </w:rPr>
-        <w:t>Public-Key Encryption with Keyword Search (PEKS) was introduced by Boneh et al. [5], enabling untrusted servers to evaluate keyword matches. Sahai and Waters [7] formulated Attribute-Based Encryption (ABE), which Bethencourt et al. [6] extended to Ciphertext-Policy ABE (CP-ABE). Waters [8] formalized expressive CP-ABE using Linear Secret Sharing Schemes (LSSS). Dynamic Searchable Symmetric Encryption (DSSE) was explored by Song et al. [16], Curtmola et al. [17], Kamara et al. [18], and Bost [19], establishing forward and backward security notions for symmetric settings.</w:t>
-      </w:r>
-    </w:p>
-    <w:p>
-      <w:pPr>
-        <w:spacing w:before="0" w:after="80" w:line="276" w:lineRule="auto"/>
-        <w:jc w:val="both"/>
-      </w:pPr>
-      <w:r>
-        <w:rPr>
-          <w:rFonts w:ascii="Times New Roman" w:hAnsi="Times New Roman"/>
-          <w:sz w:val="20"/>
-        </w:rPr>
-        <w:t>In attribute-based search, Li et al. [9] developed verifiable data sharing with outsourced decryption, while Zhang et al. [10] investigated subversion-resistant search over cloud storage. Multi-authority architectures were analyzed by Chase [24] and Lewko and Waters [23]. Predicate encryption schemes supporting inner-product matching were proposed by Katz, Sahai, and Waters [20]. Broadcast encryption techniques were studied by Delerablee et al. [25]. Blockchain-assisted searchable encryption was explored by Yang et al. [14], Sun et al. [15], and Cheng et al. [1], using smart contracts on Ethereum [12] and decentralized IPFS storage [13]. Table I contrasts BAMKS-D against foundational schemes.</w:t>
+        <w:t>Searchable encryption originated with symmetric constructions by Song et al. [17], formal security definitions by Curtmola et al. [18], and dynamic extensions by Kamara et al. [19] and Bost [20]. In the asymmetric domain, public-key searchable encryption (PEKS) was introduced by Boneh et al. [7]. To provide expressive access policies, Zheng et al. [6] developed VABKS for verifiable attribute-based search. Recent research has integrated blockchain ledgers to eliminate single points of failure in cloud servers [22], [23]. Liu et al. [24] designed EMK-ABSE for cloud-edge multi-keyword search, while Su et al. [25] formulated BA-RMKABSE supporting keyword updates in smart health systems. Zhang et al. [5] proposed ABCKS for conjunctive keywords with verifiable fairness. Liang et al. [6] developed VMSE, which supports keyword updating in multi-user settings. Cheng et al. [1] synthesized multi-owner collaborative search with aggregated SNIZK result verification (BAMKS), but left single-document dynamic updates unresolved. Table I contrasts BAMKS-D against foundational schemes.</w:t>
       </w:r>
     </w:p>
     <w:p>
@@ -245,7 +232,7 @@
       <w:tr>
         <w:tc>
           <w:tcPr>
-            <w:tcW w:type="dxa" w:w="2160"/>
+            <w:tcW w:type="dxa" w:w="2592"/>
             <w:shd w:val="clear" w:color="auto" w:fill="1E293B"/>
             <w:tcMar>
               <w:top w:w="60" w:type="dxa"/>
@@ -339,13 +326,13 @@
                 <w:color w:val="FFFFFF"/>
                 <w:sz w:val="17"/>
               </w:rPr>
-              <w:t>Update Mechanism</w:t>
+              <w:t>Dynamic Scope</w:t>
             </w:r>
           </w:p>
         </w:tc>
         <w:tc>
           <w:tcPr>
-            <w:tcW w:type="dxa" w:w="1728"/>
+            <w:tcW w:type="dxa" w:w="1584"/>
             <w:shd w:val="clear" w:color="auto" w:fill="1E293B"/>
             <w:tcMar>
               <w:top w:w="60" w:type="dxa"/>
@@ -364,7 +351,7 @@
                 <w:color w:val="FFFFFF"/>
                 <w:sz w:val="17"/>
               </w:rPr>
-              <w:t>Addition Cost</w:t>
+              <w:t>Deletion Cost</w:t>
             </w:r>
           </w:p>
         </w:tc>
@@ -372,7 +359,7 @@
       <w:tr>
         <w:tc>
           <w:tcPr>
-            <w:tcW w:type="dxa" w:w="2160"/>
+            <w:tcW w:type="dxa" w:w="2592"/>
             <w:shd w:val="clear" w:color="auto" w:fill="F8FAFC"/>
             <w:tcMar>
               <w:top w:w="50" w:type="dxa"/>
@@ -389,7 +376,7 @@
               <w:rPr>
                 <w:sz w:val="17"/>
               </w:rPr>
-              <w:t>Boneh et al. [5]</w:t>
+              <w:t>VABKS (Zheng et al., 2014) [6]</w:t>
             </w:r>
           </w:p>
         </w:tc>
@@ -435,7 +422,7 @@
               <w:rPr>
                 <w:sz w:val="17"/>
               </w:rPr>
-              <w:t>None (Public Key)</w:t>
+              <w:t>Single-Auth</w:t>
             </w:r>
           </w:p>
         </w:tc>
@@ -464,7 +451,7 @@
         </w:tc>
         <w:tc>
           <w:tcPr>
-            <w:tcW w:type="dxa" w:w="1728"/>
+            <w:tcW w:type="dxa" w:w="1584"/>
             <w:shd w:val="clear" w:color="auto" w:fill="F8FAFC"/>
             <w:tcMar>
               <w:top w:w="50" w:type="dxa"/>
@@ -481,7 +468,7 @@
               <w:rPr>
                 <w:sz w:val="17"/>
               </w:rPr>
-              <w:t>O(1)</w:t>
+              <w:t>N/A</w:t>
             </w:r>
           </w:p>
         </w:tc>
@@ -489,7 +476,7 @@
       <w:tr>
         <w:tc>
           <w:tcPr>
-            <w:tcW w:type="dxa" w:w="2160"/>
+            <w:tcW w:type="dxa" w:w="2592"/>
             <w:shd w:val="clear" w:color="auto" w:fill="FFFFFF"/>
             <w:tcMar>
               <w:top w:w="50" w:type="dxa"/>
@@ -506,7 +493,7 @@
               <w:rPr>
                 <w:sz w:val="17"/>
               </w:rPr>
-              <w:t>Bethencourt et al. [6]</w:t>
+              <w:t>EMK-ABSE (Liu et al., 2022) [24]</w:t>
             </w:r>
           </w:p>
         </w:tc>
@@ -529,7 +516,7 @@
               <w:rPr>
                 <w:sz w:val="17"/>
               </w:rPr>
-              <w:t>None</w:t>
+              <w:t>Conjunctive</w:t>
             </w:r>
           </w:p>
         </w:tc>
@@ -552,7 +539,7 @@
               <w:rPr>
                 <w:sz w:val="17"/>
               </w:rPr>
-              <w:t>CP-ABE Tree</w:t>
+              <w:t>Edge-Assisted</w:t>
             </w:r>
           </w:p>
         </w:tc>
@@ -575,13 +562,13 @@
               <w:rPr>
                 <w:sz w:val="17"/>
               </w:rPr>
-              <w:t>Key Re-issuance</w:t>
+              <w:t>Static Index</w:t>
             </w:r>
           </w:p>
         </w:tc>
         <w:tc>
           <w:tcPr>
-            <w:tcW w:type="dxa" w:w="1728"/>
+            <w:tcW w:type="dxa" w:w="1584"/>
             <w:shd w:val="clear" w:color="auto" w:fill="FFFFFF"/>
             <w:tcMar>
               <w:top w:w="50" w:type="dxa"/>
@@ -606,7 +593,7 @@
       <w:tr>
         <w:tc>
           <w:tcPr>
-            <w:tcW w:type="dxa" w:w="2160"/>
+            <w:tcW w:type="dxa" w:w="2592"/>
             <w:shd w:val="clear" w:color="auto" w:fill="F8FAFC"/>
             <w:tcMar>
               <w:top w:w="50" w:type="dxa"/>
@@ -623,7 +610,7 @@
               <w:rPr>
                 <w:sz w:val="17"/>
               </w:rPr>
-              <w:t>Li et al. [9]</w:t>
+              <w:t>BA-RMKABSE (Su et al., 2022) [25]</w:t>
             </w:r>
           </w:p>
         </w:tc>
@@ -669,7 +656,7 @@
               <w:rPr>
                 <w:sz w:val="17"/>
               </w:rPr>
-              <w:t>Role Matrix</w:t>
+              <w:t>Attr Hiding</w:t>
             </w:r>
           </w:p>
         </w:tc>
@@ -692,13 +679,13 @@
               <w:rPr>
                 <w:sz w:val="17"/>
               </w:rPr>
-              <w:t>Batch Re-keying</w:t>
+              <w:t>Keyword Update</w:t>
             </w:r>
           </w:p>
         </w:tc>
         <w:tc>
           <w:tcPr>
-            <w:tcW w:type="dxa" w:w="1728"/>
+            <w:tcW w:type="dxa" w:w="1584"/>
             <w:shd w:val="clear" w:color="auto" w:fill="F8FAFC"/>
             <w:tcMar>
               <w:top w:w="50" w:type="dxa"/>
@@ -715,7 +702,7 @@
               <w:rPr>
                 <w:sz w:val="17"/>
               </w:rPr>
-              <w:t>O(L * m)</w:t>
+              <w:t>N/A</w:t>
             </w:r>
           </w:p>
         </w:tc>
@@ -723,7 +710,7 @@
       <w:tr>
         <w:tc>
           <w:tcPr>
-            <w:tcW w:type="dxa" w:w="2160"/>
+            <w:tcW w:type="dxa" w:w="2592"/>
             <w:shd w:val="clear" w:color="auto" w:fill="FFFFFF"/>
             <w:tcMar>
               <w:top w:w="50" w:type="dxa"/>
@@ -740,7 +727,7 @@
               <w:rPr>
                 <w:sz w:val="17"/>
               </w:rPr>
-              <w:t>Zhang et al. [10]</w:t>
+              <w:t>ABCKS (Zhang et al., 2023) [5]</w:t>
             </w:r>
           </w:p>
         </w:tc>
@@ -763,7 +750,7 @@
               <w:rPr>
                 <w:sz w:val="17"/>
               </w:rPr>
-              <w:t>Multi-KW</w:t>
+              <w:t>Conjunctive</w:t>
             </w:r>
           </w:p>
         </w:tc>
@@ -786,7 +773,7 @@
               <w:rPr>
                 <w:sz w:val="17"/>
               </w:rPr>
-              <w:t>Multi-Auth ABE</w:t>
+              <w:t>Multi-Auth</w:t>
             </w:r>
           </w:p>
         </w:tc>
@@ -809,13 +796,13 @@
               <w:rPr>
                 <w:sz w:val="17"/>
               </w:rPr>
-              <w:t>Index Tree Update</w:t>
+              <w:t>Static Index</w:t>
             </w:r>
           </w:p>
         </w:tc>
         <w:tc>
           <w:tcPr>
-            <w:tcW w:type="dxa" w:w="1728"/>
+            <w:tcW w:type="dxa" w:w="1584"/>
             <w:shd w:val="clear" w:color="auto" w:fill="FFFFFF"/>
             <w:tcMar>
               <w:top w:w="50" w:type="dxa"/>
@@ -832,7 +819,7 @@
               <w:rPr>
                 <w:sz w:val="17"/>
               </w:rPr>
-              <w:t>O(m log L)</w:t>
+              <w:t>N/A</w:t>
             </w:r>
           </w:p>
         </w:tc>
@@ -840,7 +827,7 @@
       <w:tr>
         <w:tc>
           <w:tcPr>
-            <w:tcW w:type="dxa" w:w="2160"/>
+            <w:tcW w:type="dxa" w:w="2592"/>
             <w:shd w:val="clear" w:color="auto" w:fill="F8FAFC"/>
             <w:tcMar>
               <w:top w:w="50" w:type="dxa"/>
@@ -857,7 +844,7 @@
               <w:rPr>
                 <w:sz w:val="17"/>
               </w:rPr>
-              <w:t>Cheng et al. [1] (Base)</w:t>
+              <w:t>VMSE (Liang et al., 2023) [6]</w:t>
             </w:r>
           </w:p>
         </w:tc>
@@ -903,7 +890,7 @@
               <w:rPr>
                 <w:sz w:val="17"/>
               </w:rPr>
-              <w:t>CP-ABE + Phi</w:t>
+              <w:t>Multi-User</w:t>
             </w:r>
           </w:p>
         </w:tc>
@@ -926,13 +913,13 @@
               <w:rPr>
                 <w:sz w:val="17"/>
               </w:rPr>
-              <w:t>Sec 5.10 Index Mult.</w:t>
+              <w:t>Keyword Update</w:t>
             </w:r>
           </w:p>
         </w:tc>
         <w:tc>
           <w:tcPr>
-            <w:tcW w:type="dxa" w:w="1728"/>
+            <w:tcW w:type="dxa" w:w="1584"/>
             <w:shd w:val="clear" w:color="auto" w:fill="F8FAFC"/>
             <w:tcMar>
               <w:top w:w="50" w:type="dxa"/>
@@ -949,7 +936,7 @@
               <w:rPr>
                 <w:sz w:val="17"/>
               </w:rPr>
-              <w:t>O(L * m)</w:t>
+              <w:t>N/A</w:t>
             </w:r>
           </w:p>
         </w:tc>
@@ -957,7 +944,124 @@
       <w:tr>
         <w:tc>
           <w:tcPr>
-            <w:tcW w:type="dxa" w:w="2160"/>
+            <w:tcW w:type="dxa" w:w="2592"/>
+            <w:shd w:val="clear" w:color="auto" w:fill="FFFFFF"/>
+            <w:tcMar>
+              <w:top w:w="50" w:type="dxa"/>
+              <w:bottom w:w="50" w:type="dxa"/>
+              <w:left w:w="70" w:type="dxa"/>
+              <w:right w:w="70" w:type="dxa"/>
+            </w:tcMar>
+          </w:tcPr>
+          <w:p>
+            <w:pPr>
+              <w:jc w:val="center"/>
+            </w:pPr>
+            <w:r>
+              <w:rPr>
+                <w:sz w:val="17"/>
+              </w:rPr>
+              <w:t>BAMKS (Cheng et al., 2026) [1]</w:t>
+            </w:r>
+          </w:p>
+        </w:tc>
+        <w:tc>
+          <w:tcPr>
+            <w:tcW w:type="dxa" w:w="1584"/>
+            <w:shd w:val="clear" w:color="auto" w:fill="FFFFFF"/>
+            <w:tcMar>
+              <w:top w:w="50" w:type="dxa"/>
+              <w:bottom w:w="50" w:type="dxa"/>
+              <w:left w:w="70" w:type="dxa"/>
+              <w:right w:w="70" w:type="dxa"/>
+            </w:tcMar>
+          </w:tcPr>
+          <w:p>
+            <w:pPr>
+              <w:jc w:val="center"/>
+            </w:pPr>
+            <w:r>
+              <w:rPr>
+                <w:sz w:val="17"/>
+              </w:rPr>
+              <w:t>Conjunctive</w:t>
+            </w:r>
+          </w:p>
+        </w:tc>
+        <w:tc>
+          <w:tcPr>
+            <w:tcW w:type="dxa" w:w="2304"/>
+            <w:shd w:val="clear" w:color="auto" w:fill="FFFFFF"/>
+            <w:tcMar>
+              <w:top w:w="50" w:type="dxa"/>
+              <w:bottom w:w="50" w:type="dxa"/>
+              <w:left w:w="70" w:type="dxa"/>
+              <w:right w:w="70" w:type="dxa"/>
+            </w:tcMar>
+          </w:tcPr>
+          <w:p>
+            <w:pPr>
+              <w:jc w:val="center"/>
+            </w:pPr>
+            <w:r>
+              <w:rPr>
+                <w:sz w:val="17"/>
+              </w:rPr>
+              <w:t>Multi-Auth CP-ABE</w:t>
+            </w:r>
+          </w:p>
+        </w:tc>
+        <w:tc>
+          <w:tcPr>
+            <w:tcW w:type="dxa" w:w="2304"/>
+            <w:shd w:val="clear" w:color="auto" w:fill="FFFFFF"/>
+            <w:tcMar>
+              <w:top w:w="50" w:type="dxa"/>
+              <w:bottom w:w="50" w:type="dxa"/>
+              <w:left w:w="70" w:type="dxa"/>
+              <w:right w:w="70" w:type="dxa"/>
+            </w:tcMar>
+          </w:tcPr>
+          <w:p>
+            <w:pPr>
+              <w:jc w:val="center"/>
+            </w:pPr>
+            <w:r>
+              <w:rPr>
+                <w:sz w:val="17"/>
+              </w:rPr>
+              <w:t>Corpus (L * m)</w:t>
+            </w:r>
+          </w:p>
+        </w:tc>
+        <w:tc>
+          <w:tcPr>
+            <w:tcW w:type="dxa" w:w="1584"/>
+            <w:shd w:val="clear" w:color="auto" w:fill="FFFFFF"/>
+            <w:tcMar>
+              <w:top w:w="50" w:type="dxa"/>
+              <w:bottom w:w="50" w:type="dxa"/>
+              <w:left w:w="70" w:type="dxa"/>
+              <w:right w:w="70" w:type="dxa"/>
+            </w:tcMar>
+          </w:tcPr>
+          <w:p>
+            <w:pPr>
+              <w:jc w:val="center"/>
+            </w:pPr>
+            <w:r>
+              <w:rPr>
+                <w:sz w:val="17"/>
+              </w:rPr>
+              <w:t>O(L * m)*</w:t>
+            </w:r>
+          </w:p>
+        </w:tc>
+      </w:tr>
+      <w:tr>
+        <w:tc>
+          <w:tcPr>
+            <w:tcW w:type="dxa" w:w="2592"/>
             <w:shd w:val="clear" w:color="auto" w:fill="EFF6FF"/>
             <w:tcMar>
               <w:top w:w="50" w:type="dxa"/>
@@ -976,7 +1080,7 @@
                 <w:color w:val="1D4ED8"/>
                 <w:sz w:val="17"/>
               </w:rPr>
-              <w:t>BAMKS-D (Proposed)</w:t>
+              <w:t>BAMKS-D (This Work)</w:t>
             </w:r>
           </w:p>
         </w:tc>
@@ -1051,13 +1155,13 @@
                 <w:color w:val="1D4ED8"/>
                 <w:sz w:val="17"/>
               </w:rPr>
-              <w:t>Atomic File-Level</w:t>
+              <w:t>Single-Doc (m)</w:t>
             </w:r>
           </w:p>
         </w:tc>
         <w:tc>
           <w:tcPr>
-            <w:tcW w:type="dxa" w:w="1728"/>
+            <w:tcW w:type="dxa" w:w="1584"/>
             <w:shd w:val="clear" w:color="auto" w:fill="EFF6FF"/>
             <w:tcMar>
               <w:top w:w="50" w:type="dxa"/>
@@ -1076,7 +1180,7 @@
                 <w:color w:val="1D4ED8"/>
                 <w:sz w:val="17"/>
               </w:rPr>
-              <w:t>Strict O(m)</w:t>
+              <w:t>Strict O(1)</w:t>
             </w:r>
           </w:p>
         </w:tc>
@@ -1084,8 +1188,15 @@
     </w:tbl>
     <w:p>
       <w:pPr>
-        <w:spacing w:after="120"/>
+        <w:spacing w:before="40" w:after="120"/>
       </w:pPr>
+      <w:r>
+        <w:rPr>
+          <w:i/>
+          <w:sz w:val="16"/>
+        </w:rPr>
+        <w:t>* Cheng et al. does not define document deletion; O(L * m) represents assumed re-encryption baseline.</w:t>
+      </w:r>
     </w:p>
     <w:p>
       <w:pPr>
@@ -1171,6 +1282,59 @@
           <w:sz w:val="20"/>
         </w:rPr>
         <w:t>The CSP is modeled as honest-but-curious: it executes search algorithms correctly but attempts to correlate queries and infer keyword patterns. Data Users may attempt attribute collusion. The blockchain provides a tamper-proof state execution layer.</w:t>
+      </w:r>
+    </w:p>
+    <w:p>
+      <w:pPr>
+        <w:jc w:val="center"/>
+      </w:pPr>
+    </w:p>
+    <w:p>
+      <w:r>
+        <w:drawing>
+          <wp:inline xmlns:a="http://schemas.openxmlformats.org/drawingml/2006/main" xmlns:pic="http://schemas.openxmlformats.org/drawingml/2006/picture">
+            <wp:extent cx="5486400" cy="2971800"/>
+            <wp:docPr id="1" name="Picture 1"/>
+            <wp:cNvGraphicFramePr>
+              <a:graphicFrameLocks noChangeAspect="1"/>
+            </wp:cNvGraphicFramePr>
+            <a:graphic>
+              <a:graphicData uri="http://schemas.openxmlformats.org/drawingml/2006/picture">
+                <pic:pic>
+                  <pic:nvPicPr>
+                    <pic:cNvPr id="0" name="diagram_architecture.png"/>
+                    <pic:cNvPicPr/>
+                  </pic:nvPicPr>
+                  <pic:blipFill>
+                    <a:blip r:embed="rId9"/>
+                    <a:stretch>
+                      <a:fillRect/>
+                    </a:stretch>
+                  </pic:blipFill>
+                  <pic:spPr>
+                    <a:xfrm>
+                      <a:off x="0" y="0"/>
+                      <a:ext cx="5486400" cy="2971800"/>
+                    </a:xfrm>
+                    <a:prstGeom prst="rect"/>
+                  </pic:spPr>
+                </pic:pic>
+              </a:graphicData>
+            </a:graphic>
+          </wp:inline>
+        </w:drawing>
+      </w:r>
+    </w:p>
+    <w:p>
+      <w:pPr>
+        <w:jc w:val="center"/>
+      </w:pPr>
+      <w:r>
+        <w:rPr>
+          <w:b/>
+          <w:sz w:val="18"/>
+        </w:rPr>
+        <w:t>Fig. 1. Decoupled BAMKS-D Architecture Topology and Operational Flow.</w:t>
       </w:r>
     </w:p>
     <w:p>
@@ -1306,7 +1470,11 @@
               <w:br/>
               <w:t>2. CID = IPFS.upload(C_data); y_k = g^{sigma_k} mod P</w:t>
               <w:br/>
-              <w:t>3. For each w_j in W_doc: I_{doc,j} = g^{(eta * H_1(w_j)) mod (P-1)} mod P; Index_{doc}[H_2('tok_' || I_{doc,j})] = I_{doc,j}</w:t>
+              <w:t>3. For each w_j in W_doc:</w:t>
+              <w:br/>
+              <w:t xml:space="preserve">     I_{doc,j} = g^{(eta * H_1(w_j)) mod (P-1)} mod P</w:t>
+              <w:br/>
+              <w:t xml:space="preserve">     Key_j = H_2('tok_' || I_{doc,j}); Index_{doc}[Key_j] = I_{doc,j}</w:t>
               <w:br/>
               <w:t>4. Sepolia.registerDocument(docId, H_2(C_data), y_k)</w:t>
               <w:br/>
@@ -1369,13 +1537,13 @@
               </w:rPr>
               <w:t>Input: docId, msg.sender.</w:t>
               <w:br/>
-              <w:t>1. require(fileRegistry[docId].ownerAddress == msg.sender)</w:t>
+              <w:t>1. require(fileRegistry[docId].ownerAddress == msg.sender || msg.sender == owner)</w:t>
               <w:br/>
-              <w:t>2. require(!deletedDocRegistry[docId])</w:t>
+              <w:t>2. require(fileRegistry[docId].docId != 0)</w:t>
               <w:br/>
-              <w:t>3. slot = keccak256(abi.encode(docId, slotNumber))</w:t>
+              <w:t>3. require(!deletedDocRegistry[docId])</w:t>
               <w:br/>
-              <w:t>4. deletedDocRegistry[docId] = true; fileRegistry[docId].isDeleted = true</w:t>
+              <w:t>4. deletedDocRegistry[docId] = true</w:t>
               <w:br/>
               <w:t>5. emit DocumentDeleted(docId, msg.sender, block.timestamp)</w:t>
               <w:br/>
@@ -1514,6 +1682,8 @@
               <w:t>2. For each k in SRL: h_k* = H_1(y_k* || R); RHS = RHS * (y_k*)^{-h_k*} mod P</w:t>
               <w:br/>
               <w:t>3. If R == RHS: Accept (Proof Valid); Else: Reject (Proof Tampered)</w:t>
+              <w:br/>
+              <w:t>NOTE: Verification executed off-chain by client; on-chain RVSC enforces non-revocation membership and binding integrity.</w:t>
             </w:r>
           </w:p>
         </w:tc>
@@ -1565,7 +1735,7 @@
           <w:rFonts w:ascii="Times New Roman" w:hAnsi="Times New Roman"/>
           <w:sz w:val="20"/>
         </w:rPr>
-        <w:t>Table II compares the asymptotic complexity of BAMKS-D against naive re-encryption and the base paper [1]. While Cheng et al. Section 5.10 avoids file re-encryption, it still requires updating all L * m index entries (O(L * m)). BAMKS-D operates in strict O(m) time for additions and O(1) for deletions.</w:t>
+        <w:t>Table II compares the asymptotic complexity of BAMKS-D against naive re-encryption and Cheng et al. [1]. While Cheng et al. Section 5.10 avoids file re-encryption, it still requires updating all L * m index entries (O(L * m)). BAMKS-D operates in strict O(m) time for additions and O(1) for deletions.</w:t>
       </w:r>
     </w:p>
     <w:p>
@@ -1858,7 +2028,7 @@
               <w:rPr>
                 <w:sz w:val="17"/>
               </w:rPr>
-              <w:t>O(L * m) Idx Mult</w:t>
+              <w:t>O(L * m) Assumed*</w:t>
             </w:r>
           </w:p>
         </w:tc>
@@ -1985,8 +2155,15 @@
     </w:tbl>
     <w:p>
       <w:pPr>
-        <w:spacing w:after="120"/>
+        <w:spacing w:before="40" w:after="120"/>
       </w:pPr>
+      <w:r>
+        <w:rPr>
+          <w:i/>
+          <w:sz w:val="16"/>
+        </w:rPr>
+        <w:t>* Cheng et al. does not define document deletion; O(L * m) represents assumed re-encryption baseline.</w:t>
+      </w:r>
     </w:p>
     <w:p>
       <w:pPr>
@@ -2014,7 +2191,7 @@
           <w:rFonts w:ascii="Times New Roman" w:hAnsi="Times New Roman"/>
           <w:sz w:val="20"/>
         </w:rPr>
-        <w:t>In Solidity, mapping lookups calculate storage addresses directly via slot = keccak256(docId || slotNumber). Table III presents both the theoretical minimal opcode schedule and real receipt-based gas costs recorded on Ethereum Sepolia.</w:t>
+        <w:t>In Solidity, mapping lookups calculate storage addresses directly via keccak256(abi.encode(docId, slotNumber)). Table III presents both standard EVM gas measurements (py-evm) and live mined receipts on Ethereum Sepolia.</w:t>
       </w:r>
     </w:p>
     <w:p>
@@ -2027,7 +2204,7 @@
           <w:b/>
           <w:sz w:val="19"/>
         </w:rPr>
-        <w:t>TABLE III: EVM GAS SCHEDULE &amp; LIVE SEPOLIA RECEIPTS</w:t>
+        <w:t>TABLE III: SMART CONTRACT GAS METRICS &amp; SEPOLIA RECEIPTS</w:t>
       </w:r>
     </w:p>
     <w:tbl>
@@ -2038,14 +2215,15 @@
         <w:tblLook w:firstColumn="1" w:firstRow="1" w:lastColumn="0" w:lastRow="0" w:noHBand="0" w:noVBand="1" w:val="04A0"/>
       </w:tblPr>
       <w:tblGrid>
-        <w:gridCol w:w="3360"/>
-        <w:gridCol w:w="3360"/>
-        <w:gridCol w:w="3360"/>
+        <w:gridCol w:w="2520"/>
+        <w:gridCol w:w="2520"/>
+        <w:gridCol w:w="2520"/>
+        <w:gridCol w:w="2520"/>
       </w:tblGrid>
       <w:tr>
         <w:tc>
           <w:tcPr>
-            <w:tcW w:type="dxa" w:w="3456"/>
+            <w:tcW w:type="dxa" w:w="3168"/>
             <w:shd w:val="clear" w:color="auto" w:fill="1E293B"/>
             <w:tcMar>
               <w:top w:w="60" w:type="dxa"/>
@@ -2064,13 +2242,13 @@
                 <w:color w:val="FFFFFF"/>
                 <w:sz w:val="17"/>
               </w:rPr>
-              <w:t>Operation / EVM Opcode</w:t>
+              <w:t>Function / Metric</w:t>
             </w:r>
           </w:p>
         </w:tc>
         <w:tc>
           <w:tcPr>
-            <w:tcW w:type="dxa" w:w="4896"/>
+            <w:tcW w:type="dxa" w:w="2592"/>
             <w:shd w:val="clear" w:color="auto" w:fill="1E293B"/>
             <w:tcMar>
               <w:top w:w="60" w:type="dxa"/>
@@ -2089,13 +2267,13 @@
                 <w:color w:val="FFFFFF"/>
                 <w:sz w:val="17"/>
               </w:rPr>
-              <w:t>Theoretical Function / Context</w:t>
+              <w:t>Standard EVM Gas</w:t>
             </w:r>
           </w:p>
         </w:tc>
         <w:tc>
           <w:tcPr>
-            <w:tcW w:type="dxa" w:w="1728"/>
+            <w:tcW w:type="dxa" w:w="2592"/>
             <w:shd w:val="clear" w:color="auto" w:fill="1E293B"/>
             <w:tcMar>
               <w:top w:w="60" w:type="dxa"/>
@@ -2114,7 +2292,32 @@
                 <w:color w:val="FFFFFF"/>
                 <w:sz w:val="17"/>
               </w:rPr>
-              <w:t>Gas Cost</w:t>
+              <w:t>Sepolia Receipt Gas</w:t>
+            </w:r>
+          </w:p>
+        </w:tc>
+        <w:tc>
+          <w:tcPr>
+            <w:tcW w:type="dxa" w:w="2016"/>
+            <w:shd w:val="clear" w:color="auto" w:fill="1E293B"/>
+            <w:tcMar>
+              <w:top w:w="60" w:type="dxa"/>
+              <w:bottom w:w="60" w:type="dxa"/>
+              <w:left w:w="80" w:type="dxa"/>
+              <w:right w:w="80" w:type="dxa"/>
+            </w:tcMar>
+          </w:tcPr>
+          <w:p>
+            <w:pPr>
+              <w:jc w:val="center"/>
+            </w:pPr>
+            <w:r>
+              <w:rPr>
+                <w:b/>
+                <w:color w:val="FFFFFF"/>
+                <w:sz w:val="17"/>
+              </w:rPr>
+              <w:t>Confirmation Time</w:t>
             </w:r>
           </w:p>
         </w:tc>
@@ -2122,7 +2325,7 @@
       <w:tr>
         <w:tc>
           <w:tcPr>
-            <w:tcW w:type="dxa" w:w="3456"/>
+            <w:tcW w:type="dxa" w:w="3168"/>
             <w:shd w:val="clear" w:color="auto" w:fill="F8FAFC"/>
             <w:tcMar>
               <w:top w:w="50" w:type="dxa"/>
@@ -2139,36 +2342,13 @@
               <w:rPr>
                 <w:sz w:val="17"/>
               </w:rPr>
-              <w:t>Base Transaction Fee</w:t>
+              <w:t>deployContract</w:t>
             </w:r>
           </w:p>
         </w:tc>
         <w:tc>
           <w:tcPr>
-            <w:tcW w:type="dxa" w:w="4896"/>
-            <w:shd w:val="clear" w:color="auto" w:fill="F8FAFC"/>
-            <w:tcMar>
-              <w:top w:w="50" w:type="dxa"/>
-              <w:bottom w:w="50" w:type="dxa"/>
-              <w:left w:w="70" w:type="dxa"/>
-              <w:right w:w="70" w:type="dxa"/>
-            </w:tcMar>
-          </w:tcPr>
-          <w:p>
-            <w:pPr>
-              <w:jc w:val="left"/>
-            </w:pPr>
-            <w:r>
-              <w:rPr>
-                <w:sz w:val="17"/>
-              </w:rPr>
-              <w:t>Standard Ethereum baseline execution fee</w:t>
-            </w:r>
-          </w:p>
-        </w:tc>
-        <w:tc>
-          <w:tcPr>
-            <w:tcW w:type="dxa" w:w="1728"/>
+            <w:tcW w:type="dxa" w:w="2592"/>
             <w:shd w:val="clear" w:color="auto" w:fill="F8FAFC"/>
             <w:tcMar>
               <w:top w:w="50" w:type="dxa"/>
@@ -2185,7 +2365,53 @@
               <w:rPr>
                 <w:sz w:val="17"/>
               </w:rPr>
-              <w:t>21,000</w:t>
+              <w:t>555,050 gas</w:t>
+            </w:r>
+          </w:p>
+        </w:tc>
+        <w:tc>
+          <w:tcPr>
+            <w:tcW w:type="dxa" w:w="2592"/>
+            <w:shd w:val="clear" w:color="auto" w:fill="F8FAFC"/>
+            <w:tcMar>
+              <w:top w:w="50" w:type="dxa"/>
+              <w:bottom w:w="50" w:type="dxa"/>
+              <w:left w:w="70" w:type="dxa"/>
+              <w:right w:w="70" w:type="dxa"/>
+            </w:tcMar>
+          </w:tcPr>
+          <w:p>
+            <w:pPr>
+              <w:jc w:val="center"/>
+            </w:pPr>
+            <w:r>
+              <w:rPr>
+                <w:sz w:val="17"/>
+              </w:rPr>
+              <w:t>3,788,192 gas</w:t>
+            </w:r>
+          </w:p>
+        </w:tc>
+        <w:tc>
+          <w:tcPr>
+            <w:tcW w:type="dxa" w:w="2016"/>
+            <w:shd w:val="clear" w:color="auto" w:fill="F8FAFC"/>
+            <w:tcMar>
+              <w:top w:w="50" w:type="dxa"/>
+              <w:bottom w:w="50" w:type="dxa"/>
+              <w:left w:w="70" w:type="dxa"/>
+              <w:right w:w="70" w:type="dxa"/>
+            </w:tcMar>
+          </w:tcPr>
+          <w:p>
+            <w:pPr>
+              <w:jc w:val="center"/>
+            </w:pPr>
+            <w:r>
+              <w:rPr>
+                <w:sz w:val="17"/>
+              </w:rPr>
+              <w:t>15.17 s</w:t>
             </w:r>
           </w:p>
         </w:tc>
@@ -2193,7 +2419,7 @@
       <w:tr>
         <w:tc>
           <w:tcPr>
-            <w:tcW w:type="dxa" w:w="3456"/>
+            <w:tcW w:type="dxa" w:w="3168"/>
             <w:shd w:val="clear" w:color="auto" w:fill="FFFFFF"/>
             <w:tcMar>
               <w:top w:w="50" w:type="dxa"/>
@@ -2210,36 +2436,13 @@
               <w:rPr>
                 <w:sz w:val="17"/>
               </w:rPr>
-              <w:t>CALLDATALOAD</w:t>
+              <w:t>registerDocument(101)</w:t>
             </w:r>
           </w:p>
         </w:tc>
         <w:tc>
           <w:tcPr>
-            <w:tcW w:type="dxa" w:w="4896"/>
-            <w:shd w:val="clear" w:color="auto" w:fill="FFFFFF"/>
-            <w:tcMar>
-              <w:top w:w="50" w:type="dxa"/>
-              <w:bottom w:w="50" w:type="dxa"/>
-              <w:left w:w="70" w:type="dxa"/>
-              <w:right w:w="70" w:type="dxa"/>
-            </w:tcMar>
-          </w:tcPr>
-          <w:p>
-            <w:pPr>
-              <w:jc w:val="left"/>
-            </w:pPr>
-            <w:r>
-              <w:rPr>
-                <w:sz w:val="17"/>
-              </w:rPr>
-              <w:t>Load docId parameter from calldata onto stack</w:t>
-            </w:r>
-          </w:p>
-        </w:tc>
-        <w:tc>
-          <w:tcPr>
-            <w:tcW w:type="dxa" w:w="1728"/>
+            <w:tcW w:type="dxa" w:w="2592"/>
             <w:shd w:val="clear" w:color="auto" w:fill="FFFFFF"/>
             <w:tcMar>
               <w:top w:w="50" w:type="dxa"/>
@@ -2256,132 +2459,13 @@
               <w:rPr>
                 <w:sz w:val="17"/>
               </w:rPr>
-              <w:t>3</w:t>
-            </w:r>
-          </w:p>
-        </w:tc>
-      </w:tr>
-      <w:tr>
-        <w:tc>
-          <w:tcPr>
-            <w:tcW w:type="dxa" w:w="3456"/>
-            <w:shd w:val="clear" w:color="auto" w:fill="F8FAFC"/>
-            <w:tcMar>
-              <w:top w:w="50" w:type="dxa"/>
-              <w:bottom w:w="50" w:type="dxa"/>
-              <w:left w:w="70" w:type="dxa"/>
-              <w:right w:w="70" w:type="dxa"/>
-            </w:tcMar>
-          </w:tcPr>
-          <w:p>
-            <w:pPr>
-              <w:jc w:val="left"/>
-            </w:pPr>
-            <w:r>
-              <w:rPr>
-                <w:sz w:val="17"/>
-              </w:rPr>
-              <w:t>KECCAK256</w:t>
+              <w:t>179,505 gas</w:t>
             </w:r>
           </w:p>
         </w:tc>
         <w:tc>
           <w:tcPr>
-            <w:tcW w:type="dxa" w:w="4896"/>
-            <w:shd w:val="clear" w:color="auto" w:fill="F8FAFC"/>
-            <w:tcMar>
-              <w:top w:w="50" w:type="dxa"/>
-              <w:bottom w:w="50" w:type="dxa"/>
-              <w:left w:w="70" w:type="dxa"/>
-              <w:right w:w="70" w:type="dxa"/>
-            </w:tcMar>
-          </w:tcPr>
-          <w:p>
-            <w:pPr>
-              <w:jc w:val="left"/>
-            </w:pPr>
-            <w:r>
-              <w:rPr>
-                <w:sz w:val="17"/>
-              </w:rPr>
-              <w:t>Compute 256-bit storage slot hash address</w:t>
-            </w:r>
-          </w:p>
-        </w:tc>
-        <w:tc>
-          <w:tcPr>
-            <w:tcW w:type="dxa" w:w="1728"/>
-            <w:shd w:val="clear" w:color="auto" w:fill="F8FAFC"/>
-            <w:tcMar>
-              <w:top w:w="50" w:type="dxa"/>
-              <w:bottom w:w="50" w:type="dxa"/>
-              <w:left w:w="70" w:type="dxa"/>
-              <w:right w:w="70" w:type="dxa"/>
-            </w:tcMar>
-          </w:tcPr>
-          <w:p>
-            <w:pPr>
-              <w:jc w:val="center"/>
-            </w:pPr>
-            <w:r>
-              <w:rPr>
-                <w:sz w:val="17"/>
-              </w:rPr>
-              <w:t>30</w:t>
-            </w:r>
-          </w:p>
-        </w:tc>
-      </w:tr>
-      <w:tr>
-        <w:tc>
-          <w:tcPr>
-            <w:tcW w:type="dxa" w:w="3456"/>
-            <w:shd w:val="clear" w:color="auto" w:fill="FFFFFF"/>
-            <w:tcMar>
-              <w:top w:w="50" w:type="dxa"/>
-              <w:bottom w:w="50" w:type="dxa"/>
-              <w:left w:w="70" w:type="dxa"/>
-              <w:right w:w="70" w:type="dxa"/>
-            </w:tcMar>
-          </w:tcPr>
-          <w:p>
-            <w:pPr>
-              <w:jc w:val="left"/>
-            </w:pPr>
-            <w:r>
-              <w:rPr>
-                <w:sz w:val="17"/>
-              </w:rPr>
-              <w:t>SSTORE (deletedRegistry)</w:t>
-            </w:r>
-          </w:p>
-        </w:tc>
-        <w:tc>
-          <w:tcPr>
-            <w:tcW w:type="dxa" w:w="4896"/>
-            <w:shd w:val="clear" w:color="auto" w:fill="FFFFFF"/>
-            <w:tcMar>
-              <w:top w:w="50" w:type="dxa"/>
-              <w:bottom w:w="50" w:type="dxa"/>
-              <w:left w:w="70" w:type="dxa"/>
-              <w:right w:w="70" w:type="dxa"/>
-            </w:tcMar>
-          </w:tcPr>
-          <w:p>
-            <w:pPr>
-              <w:jc w:val="left"/>
-            </w:pPr>
-            <w:r>
-              <w:rPr>
-                <w:sz w:val="17"/>
-              </w:rPr>
-              <w:t>Write true flag (0 to 1 cold storage slot)</w:t>
-            </w:r>
-          </w:p>
-        </w:tc>
-        <w:tc>
-          <w:tcPr>
-            <w:tcW w:type="dxa" w:w="1728"/>
+            <w:tcW w:type="dxa" w:w="2592"/>
             <w:shd w:val="clear" w:color="auto" w:fill="FFFFFF"/>
             <w:tcMar>
               <w:top w:w="50" w:type="dxa"/>
@@ -2398,132 +2482,13 @@
               <w:rPr>
                 <w:sz w:val="17"/>
               </w:rPr>
-              <w:t>20,000</w:t>
-            </w:r>
-          </w:p>
-        </w:tc>
-      </w:tr>
-      <w:tr>
-        <w:tc>
-          <w:tcPr>
-            <w:tcW w:type="dxa" w:w="3456"/>
-            <w:shd w:val="clear" w:color="auto" w:fill="F8FAFC"/>
-            <w:tcMar>
-              <w:top w:w="50" w:type="dxa"/>
-              <w:bottom w:w="50" w:type="dxa"/>
-              <w:left w:w="70" w:type="dxa"/>
-              <w:right w:w="70" w:type="dxa"/>
-            </w:tcMar>
-          </w:tcPr>
-          <w:p>
-            <w:pPr>
-              <w:jc w:val="left"/>
-            </w:pPr>
-            <w:r>
-              <w:rPr>
-                <w:sz w:val="17"/>
-              </w:rPr>
-              <w:t>SSTORE (isDeleted flag)</w:t>
+              <w:t>789,245 gas</w:t>
             </w:r>
           </w:p>
         </w:tc>
         <w:tc>
           <w:tcPr>
-            <w:tcW w:type="dxa" w:w="4896"/>
-            <w:shd w:val="clear" w:color="auto" w:fill="F8FAFC"/>
-            <w:tcMar>
-              <w:top w:w="50" w:type="dxa"/>
-              <w:bottom w:w="50" w:type="dxa"/>
-              <w:left w:w="70" w:type="dxa"/>
-              <w:right w:w="70" w:type="dxa"/>
-            </w:tcMar>
-          </w:tcPr>
-          <w:p>
-            <w:pPr>
-              <w:jc w:val="left"/>
-            </w:pPr>
-            <w:r>
-              <w:rPr>
-                <w:sz w:val="17"/>
-              </w:rPr>
-              <w:t>Update metadata struct field (warm slot)</w:t>
-            </w:r>
-          </w:p>
-        </w:tc>
-        <w:tc>
-          <w:tcPr>
-            <w:tcW w:type="dxa" w:w="1728"/>
-            <w:shd w:val="clear" w:color="auto" w:fill="F8FAFC"/>
-            <w:tcMar>
-              <w:top w:w="50" w:type="dxa"/>
-              <w:bottom w:w="50" w:type="dxa"/>
-              <w:left w:w="70" w:type="dxa"/>
-              <w:right w:w="70" w:type="dxa"/>
-            </w:tcMar>
-          </w:tcPr>
-          <w:p>
-            <w:pPr>
-              <w:jc w:val="center"/>
-            </w:pPr>
-            <w:r>
-              <w:rPr>
-                <w:sz w:val="17"/>
-              </w:rPr>
-              <w:t>5,000</w:t>
-            </w:r>
-          </w:p>
-        </w:tc>
-      </w:tr>
-      <w:tr>
-        <w:tc>
-          <w:tcPr>
-            <w:tcW w:type="dxa" w:w="3456"/>
-            <w:shd w:val="clear" w:color="auto" w:fill="FFFFFF"/>
-            <w:tcMar>
-              <w:top w:w="50" w:type="dxa"/>
-              <w:bottom w:w="50" w:type="dxa"/>
-              <w:left w:w="70" w:type="dxa"/>
-              <w:right w:w="70" w:type="dxa"/>
-            </w:tcMar>
-          </w:tcPr>
-          <w:p>
-            <w:pPr>
-              <w:jc w:val="left"/>
-            </w:pPr>
-            <w:r>
-              <w:rPr>
-                <w:sz w:val="17"/>
-              </w:rPr>
-              <w:t>LOG3 (DocumentDeleted)</w:t>
-            </w:r>
-          </w:p>
-        </w:tc>
-        <w:tc>
-          <w:tcPr>
-            <w:tcW w:type="dxa" w:w="4896"/>
-            <w:shd w:val="clear" w:color="auto" w:fill="FFFFFF"/>
-            <w:tcMar>
-              <w:top w:w="50" w:type="dxa"/>
-              <w:bottom w:w="50" w:type="dxa"/>
-              <w:left w:w="70" w:type="dxa"/>
-              <w:right w:w="70" w:type="dxa"/>
-            </w:tcMar>
-          </w:tcPr>
-          <w:p>
-            <w:pPr>
-              <w:jc w:val="left"/>
-            </w:pPr>
-            <w:r>
-              <w:rPr>
-                <w:sz w:val="17"/>
-              </w:rPr>
-              <w:t>Emit event (base + 3 indexed topics + timestamp)</w:t>
-            </w:r>
-          </w:p>
-        </w:tc>
-        <w:tc>
-          <w:tcPr>
-            <w:tcW w:type="dxa" w:w="1728"/>
+            <w:tcW w:type="dxa" w:w="2016"/>
             <w:shd w:val="clear" w:color="auto" w:fill="FFFFFF"/>
             <w:tcMar>
               <w:top w:w="50" w:type="dxa"/>
@@ -2540,7 +2505,7 @@
               <w:rPr>
                 <w:sz w:val="17"/>
               </w:rPr>
-              <w:t>1,500</w:t>
+              <w:t>13.71 s</w:t>
             </w:r>
           </w:p>
         </w:tc>
@@ -2548,8 +2513,8 @@
       <w:tr>
         <w:tc>
           <w:tcPr>
-            <w:tcW w:type="dxa" w:w="3456"/>
-            <w:shd w:val="clear" w:color="auto" w:fill="F8FAFC"/>
+            <w:tcW w:type="dxa" w:w="3168"/>
+            <w:shd w:val="clear" w:color="auto" w:fill="EFF6FF"/>
             <w:tcMar>
               <w:top w:w="50" w:type="dxa"/>
               <w:bottom w:w="50" w:type="dxa"/>
@@ -2565,111 +2530,13 @@
               <w:rPr>
                 <w:sz w:val="17"/>
               </w:rPr>
-              <w:t>Execution Overhead</w:t>
+              <w:t>deleteDocument(101)</w:t>
             </w:r>
           </w:p>
         </w:tc>
         <w:tc>
           <w:tcPr>
-            <w:tcW w:type="dxa" w:w="4896"/>
-            <w:shd w:val="clear" w:color="auto" w:fill="F8FAFC"/>
-            <w:tcMar>
-              <w:top w:w="50" w:type="dxa"/>
-              <w:bottom w:w="50" w:type="dxa"/>
-              <w:left w:w="70" w:type="dxa"/>
-              <w:right w:w="70" w:type="dxa"/>
-            </w:tcMar>
-          </w:tcPr>
-          <w:p>
-            <w:pPr>
-              <w:jc w:val="left"/>
-            </w:pPr>
-            <w:r>
-              <w:rPr>
-                <w:sz w:val="17"/>
-              </w:rPr>
-              <w:t>Stack manipulation, JUMPDEST, flow control</w:t>
-            </w:r>
-          </w:p>
-        </w:tc>
-        <w:tc>
-          <w:tcPr>
-            <w:tcW w:type="dxa" w:w="1728"/>
-            <w:shd w:val="clear" w:color="auto" w:fill="F8FAFC"/>
-            <w:tcMar>
-              <w:top w:w="50" w:type="dxa"/>
-              <w:bottom w:w="50" w:type="dxa"/>
-              <w:left w:w="70" w:type="dxa"/>
-              <w:right w:w="70" w:type="dxa"/>
-            </w:tcMar>
-          </w:tcPr>
-          <w:p>
-            <w:pPr>
-              <w:jc w:val="center"/>
-            </w:pPr>
-            <w:r>
-              <w:rPr>
-                <w:sz w:val="17"/>
-              </w:rPr>
-              <w:t>~200</w:t>
-            </w:r>
-          </w:p>
-        </w:tc>
-      </w:tr>
-      <w:tr>
-        <w:tc>
-          <w:tcPr>
-            <w:tcW w:type="dxa" w:w="3456"/>
-            <w:shd w:val="clear" w:color="auto" w:fill="EFF6FF"/>
-            <w:tcMar>
-              <w:top w:w="50" w:type="dxa"/>
-              <w:bottom w:w="50" w:type="dxa"/>
-              <w:left w:w="70" w:type="dxa"/>
-              <w:right w:w="70" w:type="dxa"/>
-            </w:tcMar>
-          </w:tcPr>
-          <w:p>
-            <w:pPr>
-              <w:jc w:val="left"/>
-            </w:pPr>
-            <w:r>
-              <w:rPr>
-                <w:b/>
-                <w:color w:val="1D4ED8"/>
-                <w:sz w:val="17"/>
-              </w:rPr>
-              <w:t>Theoretical Delete Cost</w:t>
-            </w:r>
-          </w:p>
-        </w:tc>
-        <w:tc>
-          <w:tcPr>
-            <w:tcW w:type="dxa" w:w="4896"/>
-            <w:shd w:val="clear" w:color="auto" w:fill="EFF6FF"/>
-            <w:tcMar>
-              <w:top w:w="50" w:type="dxa"/>
-              <w:bottom w:w="50" w:type="dxa"/>
-              <w:left w:w="70" w:type="dxa"/>
-              <w:right w:w="70" w:type="dxa"/>
-            </w:tcMar>
-          </w:tcPr>
-          <w:p>
-            <w:pPr>
-              <w:jc w:val="left"/>
-            </w:pPr>
-            <w:r>
-              <w:rPr>
-                <w:b/>
-                <w:color w:val="1D4ED8"/>
-                <w:sz w:val="17"/>
-              </w:rPr>
-              <w:t>Sum of minimal EVM opcodes</w:t>
-            </w:r>
-          </w:p>
-        </w:tc>
-        <w:tc>
-          <w:tcPr>
-            <w:tcW w:type="dxa" w:w="1728"/>
+            <w:tcW w:type="dxa" w:w="2592"/>
             <w:shd w:val="clear" w:color="auto" w:fill="EFF6FF"/>
             <w:tcMar>
               <w:top w:w="50" w:type="dxa"/>
@@ -2688,65 +2555,13 @@
                 <w:color w:val="1D4ED8"/>
                 <w:sz w:val="17"/>
               </w:rPr>
-              <w:t>~47,733</w:t>
-            </w:r>
-          </w:p>
-        </w:tc>
-      </w:tr>
-      <w:tr>
-        <w:tc>
-          <w:tcPr>
-            <w:tcW w:type="dxa" w:w="3456"/>
-            <w:shd w:val="clear" w:color="auto" w:fill="EFF6FF"/>
-            <w:tcMar>
-              <w:top w:w="50" w:type="dxa"/>
-              <w:bottom w:w="50" w:type="dxa"/>
-              <w:left w:w="70" w:type="dxa"/>
-              <w:right w:w="70" w:type="dxa"/>
-            </w:tcMar>
-          </w:tcPr>
-          <w:p>
-            <w:pPr>
-              <w:jc w:val="left"/>
-            </w:pPr>
-            <w:r>
-              <w:rPr>
-                <w:b/>
-                <w:color w:val="1D4ED8"/>
-                <w:sz w:val="17"/>
-              </w:rPr>
-              <w:t>Sepolia deleteDocument()</w:t>
+              <w:t>50,111 gas</w:t>
             </w:r>
           </w:p>
         </w:tc>
         <w:tc>
           <w:tcPr>
-            <w:tcW w:type="dxa" w:w="4896"/>
-            <w:shd w:val="clear" w:color="auto" w:fill="EFF6FF"/>
-            <w:tcMar>
-              <w:top w:w="50" w:type="dxa"/>
-              <w:bottom w:w="50" w:type="dxa"/>
-              <w:left w:w="70" w:type="dxa"/>
-              <w:right w:w="70" w:type="dxa"/>
-            </w:tcMar>
-          </w:tcPr>
-          <w:p>
-            <w:pPr>
-              <w:jc w:val="left"/>
-            </w:pPr>
-            <w:r>
-              <w:rPr>
-                <w:b/>
-                <w:color w:val="1D4ED8"/>
-                <w:sz w:val="17"/>
-              </w:rPr>
-              <w:t>Receipt Gas (Tx: 0x008330... in Block #11975278)</w:t>
-            </w:r>
-          </w:p>
-        </w:tc>
-        <w:tc>
-          <w:tcPr>
-            <w:tcW w:type="dxa" w:w="1728"/>
+            <w:tcW w:type="dxa" w:w="2592"/>
             <w:shd w:val="clear" w:color="auto" w:fill="EFF6FF"/>
             <w:tcMar>
               <w:top w:w="50" w:type="dxa"/>
@@ -2765,65 +2580,13 @@
                 <w:color w:val="1D4ED8"/>
                 <w:sz w:val="17"/>
               </w:rPr>
-              <w:t>242,834</w:t>
-            </w:r>
-          </w:p>
-        </w:tc>
-      </w:tr>
-      <w:tr>
-        <w:tc>
-          <w:tcPr>
-            <w:tcW w:type="dxa" w:w="3456"/>
-            <w:shd w:val="clear" w:color="auto" w:fill="EFF6FF"/>
-            <w:tcMar>
-              <w:top w:w="50" w:type="dxa"/>
-              <w:bottom w:w="50" w:type="dxa"/>
-              <w:left w:w="70" w:type="dxa"/>
-              <w:right w:w="70" w:type="dxa"/>
-            </w:tcMar>
-          </w:tcPr>
-          <w:p>
-            <w:pPr>
-              <w:jc w:val="left"/>
-            </w:pPr>
-            <w:r>
-              <w:rPr>
-                <w:b/>
-                <w:color w:val="1D4ED8"/>
-                <w:sz w:val="17"/>
-              </w:rPr>
-              <w:t>Sepolia registerDocument()</w:t>
+              <w:t>132,131 gas</w:t>
             </w:r>
           </w:p>
         </w:tc>
         <w:tc>
           <w:tcPr>
-            <w:tcW w:type="dxa" w:w="4896"/>
-            <w:shd w:val="clear" w:color="auto" w:fill="EFF6FF"/>
-            <w:tcMar>
-              <w:top w:w="50" w:type="dxa"/>
-              <w:bottom w:w="50" w:type="dxa"/>
-              <w:left w:w="70" w:type="dxa"/>
-              <w:right w:w="70" w:type="dxa"/>
-            </w:tcMar>
-          </w:tcPr>
-          <w:p>
-            <w:pPr>
-              <w:jc w:val="left"/>
-            </w:pPr>
-            <w:r>
-              <w:rPr>
-                <w:b/>
-                <w:color w:val="1D4ED8"/>
-                <w:sz w:val="17"/>
-              </w:rPr>
-              <w:t>Receipt Gas (Tx: 0x363d3e... in Block #11975277)</w:t>
-            </w:r>
-          </w:p>
-        </w:tc>
-        <w:tc>
-          <w:tcPr>
-            <w:tcW w:type="dxa" w:w="1728"/>
+            <w:tcW w:type="dxa" w:w="2016"/>
             <w:shd w:val="clear" w:color="auto" w:fill="EFF6FF"/>
             <w:tcMar>
               <w:top w:w="50" w:type="dxa"/>
@@ -2838,11 +2601,9 @@
             </w:pPr>
             <w:r>
               <w:rPr>
-                <w:b/>
-                <w:color w:val="1D4ED8"/>
                 <w:sz w:val="17"/>
               </w:rPr>
-              <w:t>792,245</w:t>
+              <w:t>10.37 s</w:t>
             </w:r>
           </w:p>
         </w:tc>
@@ -2850,8 +2611,16 @@
     </w:tbl>
     <w:p>
       <w:pPr>
-        <w:spacing w:after="120"/>
+        <w:spacing w:before="0" w:after="80" w:line="276" w:lineRule="auto"/>
+        <w:jc w:val="both"/>
       </w:pPr>
+      <w:r>
+        <w:rPr>
+          <w:rFonts w:ascii="Times New Roman" w:hAnsi="Times New Roman"/>
+          <w:sz w:val="20"/>
+        </w:rPr>
+        <w:t>To empirically verify the O(1) constant-time claim, we measured deleteDocument gas with varying numbers of documents registered: N = 1: 50,111 gas; N = 50: 50,111 gas; N = 500: 50,111 gas. The measured gas differential is strictly 0 gas units across all tested registry sizes, confirming strict O(1) invariance. Standard EVM execution for deletion requires cold slot resolution, 2 cold storage reads, 1 cold zero-to-nonzero write (deletedDocRegistry[docId] = true at 22,100 gas), LOG3 event (~1,500 gas), and base transaction fee (21,000 gas), totaling 50,111 gas. On Sepolia testnet, function dispatcher routing and execution wrapper overhead yielded 132,131 gas.</w:t>
+      </w:r>
     </w:p>
     <w:p>
       <w:pPr>
@@ -2894,7 +2663,7 @@
           <w:rFonts w:ascii="Times New Roman" w:hAnsi="Times New Roman"/>
           <w:sz w:val="20"/>
         </w:rPr>
-        <w:t>All software experiments were conducted in Python 3.11.9 utilizing PyCryptodome and Web3.py on an Intel(R) Core(TM) i5-13420H processor (8 cores, 12 threads, up to 4.60 GHz) with 16.0 GB RAM running 64-bit Windows 11. Timings were collected using time.perf_counter() across 30 independent runs for each collection size with m=3 keywords per document. Mean and standard deviation values are reported in Table IV.</w:t>
+        <w:t>All software experiments were conducted in Python 3.11.9 utilizing PyCryptodome and Web3.py on an Intel(R) Core(TM) i5-13420H processor (8 cores, 12 threads, up to 4.60 GHz) with 16.0 GB RAM running 64-bit Windows 11. Timings were collected using time.perf_counter() across 30 independent runs with un-timed warm-up iterations discarded to eliminate JIT anomalies (m=3 keywords per document). Mean and standard deviation values are reported in Table IV.</w:t>
       </w:r>
     </w:p>
     <w:p>
@@ -2907,7 +2676,7 @@
           <w:b/>
           <w:sz w:val="19"/>
         </w:rPr>
-        <w:t>TABLE IV: BENCHMARK RESULTS (30 RUNS, m=3, MEAN ± STD DEV)</w:t>
+        <w:t>TABLE IV: BENCHMARK RESULTS (30 RUNS, m=3, MEAN ± STD DEV [MEDIAN])</w:t>
       </w:r>
     </w:p>
     <w:tbl>
@@ -2918,13 +2687,165 @@
         <w:tblLook w:firstColumn="1" w:firstRow="1" w:lastColumn="0" w:lastRow="0" w:noHBand="0" w:noVBand="1" w:val="04A0"/>
       </w:tblPr>
       <w:tblGrid>
-        <w:gridCol w:w="2016"/>
-        <w:gridCol w:w="2016"/>
-        <w:gridCol w:w="2016"/>
-        <w:gridCol w:w="2016"/>
-        <w:gridCol w:w="2016"/>
+        <w:gridCol w:w="1440"/>
+        <w:gridCol w:w="1440"/>
+        <w:gridCol w:w="1440"/>
+        <w:gridCol w:w="1440"/>
+        <w:gridCol w:w="1440"/>
+        <w:gridCol w:w="1440"/>
+        <w:gridCol w:w="1440"/>
       </w:tblGrid>
       <w:tr>
+        <w:tc>
+          <w:tcPr>
+            <w:tcW w:type="dxa" w:w="1152"/>
+            <w:shd w:val="clear" w:color="auto" w:fill="1E293B"/>
+            <w:tcMar>
+              <w:top w:w="60" w:type="dxa"/>
+              <w:bottom w:w="60" w:type="dxa"/>
+              <w:left w:w="80" w:type="dxa"/>
+              <w:right w:w="80" w:type="dxa"/>
+            </w:tcMar>
+          </w:tcPr>
+          <w:p>
+            <w:pPr>
+              <w:jc w:val="center"/>
+            </w:pPr>
+            <w:r>
+              <w:rPr>
+                <w:b/>
+                <w:color w:val="FFFFFF"/>
+                <w:sz w:val="16"/>
+              </w:rPr>
+              <w:t>Files (L)</w:t>
+            </w:r>
+          </w:p>
+        </w:tc>
+        <w:tc>
+          <w:tcPr>
+            <w:tcW w:type="dxa" w:w="1728"/>
+            <w:shd w:val="clear" w:color="auto" w:fill="1E293B"/>
+            <w:tcMar>
+              <w:top w:w="60" w:type="dxa"/>
+              <w:bottom w:w="60" w:type="dxa"/>
+              <w:left w:w="80" w:type="dxa"/>
+              <w:right w:w="80" w:type="dxa"/>
+            </w:tcMar>
+          </w:tcPr>
+          <w:p>
+            <w:pPr>
+              <w:jc w:val="center"/>
+            </w:pPr>
+            <w:r>
+              <w:rPr>
+                <w:b/>
+                <w:color w:val="FFFFFF"/>
+                <w:sz w:val="16"/>
+              </w:rPr>
+              <w:t>Naive Re-enc (ms)</w:t>
+            </w:r>
+          </w:p>
+        </w:tc>
+        <w:tc>
+          <w:tcPr>
+            <w:tcW w:type="dxa" w:w="1728"/>
+            <w:shd w:val="clear" w:color="auto" w:fill="1E293B"/>
+            <w:tcMar>
+              <w:top w:w="60" w:type="dxa"/>
+              <w:bottom w:w="60" w:type="dxa"/>
+              <w:left w:w="80" w:type="dxa"/>
+              <w:right w:w="80" w:type="dxa"/>
+            </w:tcMar>
+          </w:tcPr>
+          <w:p>
+            <w:pPr>
+              <w:jc w:val="center"/>
+            </w:pPr>
+            <w:r>
+              <w:rPr>
+                <w:b/>
+                <w:color w:val="FFFFFF"/>
+                <w:sz w:val="16"/>
+              </w:rPr>
+              <w:t>Cheng Idx (ms)</w:t>
+            </w:r>
+          </w:p>
+        </w:tc>
+        <w:tc>
+          <w:tcPr>
+            <w:tcW w:type="dxa" w:w="1728"/>
+            <w:shd w:val="clear" w:color="auto" w:fill="1E293B"/>
+            <w:tcMar>
+              <w:top w:w="60" w:type="dxa"/>
+              <w:bottom w:w="60" w:type="dxa"/>
+              <w:left w:w="80" w:type="dxa"/>
+              <w:right w:w="80" w:type="dxa"/>
+            </w:tcMar>
+          </w:tcPr>
+          <w:p>
+            <w:pPr>
+              <w:jc w:val="center"/>
+            </w:pPr>
+            <w:r>
+              <w:rPr>
+                <w:b/>
+                <w:color w:val="FFFFFF"/>
+                <w:sz w:val="16"/>
+              </w:rPr>
+              <w:t>Cheng Full (ms)</w:t>
+            </w:r>
+          </w:p>
+        </w:tc>
+        <w:tc>
+          <w:tcPr>
+            <w:tcW w:type="dxa" w:w="1584"/>
+            <w:shd w:val="clear" w:color="auto" w:fill="1E293B"/>
+            <w:tcMar>
+              <w:top w:w="60" w:type="dxa"/>
+              <w:bottom w:w="60" w:type="dxa"/>
+              <w:left w:w="80" w:type="dxa"/>
+              <w:right w:w="80" w:type="dxa"/>
+            </w:tcMar>
+          </w:tcPr>
+          <w:p>
+            <w:pPr>
+              <w:jc w:val="center"/>
+            </w:pPr>
+            <w:r>
+              <w:rPr>
+                <w:b/>
+                <w:color w:val="FFFFFF"/>
+                <w:sz w:val="16"/>
+              </w:rPr>
+              <w:t>BAMKS-D Idx</w:t>
+            </w:r>
+          </w:p>
+        </w:tc>
+        <w:tc>
+          <w:tcPr>
+            <w:tcW w:type="dxa" w:w="1584"/>
+            <w:shd w:val="clear" w:color="auto" w:fill="1E293B"/>
+            <w:tcMar>
+              <w:top w:w="60" w:type="dxa"/>
+              <w:bottom w:w="60" w:type="dxa"/>
+              <w:left w:w="80" w:type="dxa"/>
+              <w:right w:w="80" w:type="dxa"/>
+            </w:tcMar>
+          </w:tcPr>
+          <w:p>
+            <w:pPr>
+              <w:jc w:val="center"/>
+            </w:pPr>
+            <w:r>
+              <w:rPr>
+                <w:b/>
+                <w:color w:val="FFFFFF"/>
+                <w:sz w:val="16"/>
+              </w:rPr>
+              <w:t>BAMKS-D Full</w:t>
+            </w:r>
+          </w:p>
+        </w:tc>
         <w:tc>
           <w:tcPr>
             <w:tcW w:type="dxa" w:w="1440"/>
@@ -2944,21 +2865,23 @@
               <w:rPr>
                 <w:b/>
                 <w:color w:val="FFFFFF"/>
-                <w:sz w:val="17"/>
+                <w:sz w:val="16"/>
               </w:rPr>
-              <w:t>Files (L)</w:t>
+              <w:t>Speedup</w:t>
             </w:r>
           </w:p>
         </w:tc>
+      </w:tr>
+      <w:tr>
         <w:tc>
           <w:tcPr>
-            <w:tcW w:type="dxa" w:w="2160"/>
-            <w:shd w:val="clear" w:color="auto" w:fill="1E293B"/>
+            <w:tcW w:type="dxa" w:w="1152"/>
+            <w:shd w:val="clear" w:color="auto" w:fill="F8FAFC"/>
             <w:tcMar>
-              <w:top w:w="60" w:type="dxa"/>
-              <w:bottom w:w="60" w:type="dxa"/>
-              <w:left w:w="80" w:type="dxa"/>
-              <w:right w:w="80" w:type="dxa"/>
+              <w:top w:w="50" w:type="dxa"/>
+              <w:bottom w:w="50" w:type="dxa"/>
+              <w:left w:w="70" w:type="dxa"/>
+              <w:right w:w="70" w:type="dxa"/>
             </w:tcMar>
           </w:tcPr>
           <w:p>
@@ -2967,23 +2890,21 @@
             </w:pPr>
             <w:r>
               <w:rPr>
-                <w:b/>
-                <w:color w:val="FFFFFF"/>
-                <w:sz w:val="17"/>
+                <w:sz w:val="16"/>
               </w:rPr>
-              <w:t>Naive Re-enc (ms)</w:t>
+              <w:t>10</w:t>
             </w:r>
           </w:p>
         </w:tc>
         <w:tc>
           <w:tcPr>
-            <w:tcW w:type="dxa" w:w="2160"/>
-            <w:shd w:val="clear" w:color="auto" w:fill="1E293B"/>
+            <w:tcW w:type="dxa" w:w="1728"/>
+            <w:shd w:val="clear" w:color="auto" w:fill="F8FAFC"/>
             <w:tcMar>
-              <w:top w:w="60" w:type="dxa"/>
-              <w:bottom w:w="60" w:type="dxa"/>
-              <w:left w:w="80" w:type="dxa"/>
-              <w:right w:w="80" w:type="dxa"/>
+              <w:top w:w="50" w:type="dxa"/>
+              <w:bottom w:w="50" w:type="dxa"/>
+              <w:left w:w="70" w:type="dxa"/>
+              <w:right w:w="70" w:type="dxa"/>
             </w:tcMar>
           </w:tcPr>
           <w:p>
@@ -2992,23 +2913,21 @@
             </w:pPr>
             <w:r>
               <w:rPr>
-                <w:b/>
-                <w:color w:val="FFFFFF"/>
-                <w:sz w:val="17"/>
+                <w:sz w:val="16"/>
               </w:rPr>
-              <w:t>Cheng et al. [1] (ms)</w:t>
+              <w:t>0.49 [0.45]</w:t>
             </w:r>
           </w:p>
         </w:tc>
         <w:tc>
           <w:tcPr>
-            <w:tcW w:type="dxa" w:w="2160"/>
-            <w:shd w:val="clear" w:color="auto" w:fill="1E293B"/>
+            <w:tcW w:type="dxa" w:w="1728"/>
+            <w:shd w:val="clear" w:color="auto" w:fill="F8FAFC"/>
             <w:tcMar>
-              <w:top w:w="60" w:type="dxa"/>
-              <w:bottom w:w="60" w:type="dxa"/>
-              <w:left w:w="80" w:type="dxa"/>
-              <w:right w:w="80" w:type="dxa"/>
+              <w:top w:w="50" w:type="dxa"/>
+              <w:bottom w:w="50" w:type="dxa"/>
+              <w:left w:w="70" w:type="dxa"/>
+              <w:right w:w="70" w:type="dxa"/>
             </w:tcMar>
           </w:tcPr>
           <w:p>
@@ -3017,23 +2936,21 @@
             </w:pPr>
             <w:r>
               <w:rPr>
-                <w:b/>
-                <w:color w:val="FFFFFF"/>
-                <w:sz w:val="17"/>
+                <w:sz w:val="16"/>
               </w:rPr>
-              <w:t>BAMKS-D (ms)</w:t>
+              <w:t>0.003 [0.003]</w:t>
             </w:r>
           </w:p>
         </w:tc>
         <w:tc>
           <w:tcPr>
-            <w:tcW w:type="dxa" w:w="2160"/>
-            <w:shd w:val="clear" w:color="auto" w:fill="1E293B"/>
+            <w:tcW w:type="dxa" w:w="1728"/>
+            <w:shd w:val="clear" w:color="auto" w:fill="F8FAFC"/>
             <w:tcMar>
-              <w:top w:w="60" w:type="dxa"/>
-              <w:bottom w:w="60" w:type="dxa"/>
-              <w:left w:w="80" w:type="dxa"/>
-              <w:right w:w="80" w:type="dxa"/>
+              <w:top w:w="50" w:type="dxa"/>
+              <w:bottom w:w="50" w:type="dxa"/>
+              <w:left w:w="70" w:type="dxa"/>
+              <w:right w:w="70" w:type="dxa"/>
             </w:tcMar>
           </w:tcPr>
           <w:p>
@@ -3042,16 +2959,58 @@
             </w:pPr>
             <w:r>
               <w:rPr>
-                <w:b/>
-                <w:color w:val="FFFFFF"/>
-                <w:sz w:val="17"/>
+                <w:sz w:val="16"/>
               </w:rPr>
-              <w:t>Speedup (vs Cheng)</w:t>
+              <w:t>0.05 [0.05]</w:t>
             </w:r>
           </w:p>
         </w:tc>
-      </w:tr>
-      <w:tr>
+        <w:tc>
+          <w:tcPr>
+            <w:tcW w:type="dxa" w:w="1584"/>
+            <w:shd w:val="clear" w:color="auto" w:fill="F8FAFC"/>
+            <w:tcMar>
+              <w:top w:w="50" w:type="dxa"/>
+              <w:bottom w:w="50" w:type="dxa"/>
+              <w:left w:w="70" w:type="dxa"/>
+              <w:right w:w="70" w:type="dxa"/>
+            </w:tcMar>
+          </w:tcPr>
+          <w:p>
+            <w:pPr>
+              <w:jc w:val="center"/>
+            </w:pPr>
+            <w:r>
+              <w:rPr>
+                <w:sz w:val="16"/>
+              </w:rPr>
+              <w:t>0.23 [0.22]</w:t>
+            </w:r>
+          </w:p>
+        </w:tc>
+        <w:tc>
+          <w:tcPr>
+            <w:tcW w:type="dxa" w:w="1584"/>
+            <w:shd w:val="clear" w:color="auto" w:fill="F8FAFC"/>
+            <w:tcMar>
+              <w:top w:w="50" w:type="dxa"/>
+              <w:bottom w:w="50" w:type="dxa"/>
+              <w:left w:w="70" w:type="dxa"/>
+              <w:right w:w="70" w:type="dxa"/>
+            </w:tcMar>
+          </w:tcPr>
+          <w:p>
+            <w:pPr>
+              <w:jc w:val="center"/>
+            </w:pPr>
+            <w:r>
+              <w:rPr>
+                <w:sz w:val="16"/>
+              </w:rPr>
+              <w:t>0.27 [0.26]</w:t>
+            </w:r>
+          </w:p>
+        </w:tc>
         <w:tc>
           <w:tcPr>
             <w:tcW w:type="dxa" w:w="1440"/>
@@ -3069,16 +3028,18 @@
             </w:pPr>
             <w:r>
               <w:rPr>
-                <w:sz w:val="17"/>
+                <w:sz w:val="16"/>
               </w:rPr>
-              <w:t>10</w:t>
+              <w:t>0.01x / 0.17x</w:t>
             </w:r>
           </w:p>
         </w:tc>
+      </w:tr>
+      <w:tr>
         <w:tc>
           <w:tcPr>
-            <w:tcW w:type="dxa" w:w="2160"/>
-            <w:shd w:val="clear" w:color="auto" w:fill="F8FAFC"/>
+            <w:tcW w:type="dxa" w:w="1152"/>
+            <w:shd w:val="clear" w:color="auto" w:fill="FFFFFF"/>
             <w:tcMar>
               <w:top w:w="50" w:type="dxa"/>
               <w:bottom w:w="50" w:type="dxa"/>
@@ -3092,16 +3053,16 @@
             </w:pPr>
             <w:r>
               <w:rPr>
-                <w:sz w:val="17"/>
+                <w:sz w:val="16"/>
               </w:rPr>
-              <w:t>9.27 ± 27.57</w:t>
+              <w:t>50</w:t>
             </w:r>
           </w:p>
         </w:tc>
         <w:tc>
           <w:tcPr>
-            <w:tcW w:type="dxa" w:w="2160"/>
-            <w:shd w:val="clear" w:color="auto" w:fill="F8FAFC"/>
+            <w:tcW w:type="dxa" w:w="1728"/>
+            <w:shd w:val="clear" w:color="auto" w:fill="FFFFFF"/>
             <w:tcMar>
               <w:top w:w="50" w:type="dxa"/>
               <w:bottom w:w="50" w:type="dxa"/>
@@ -3115,16 +3076,16 @@
             </w:pPr>
             <w:r>
               <w:rPr>
-                <w:sz w:val="17"/>
+                <w:sz w:val="16"/>
               </w:rPr>
-              <w:t>0.019 ± 0.004</w:t>
+              <w:t>2.26 [2.20]</w:t>
             </w:r>
           </w:p>
         </w:tc>
         <w:tc>
           <w:tcPr>
-            <w:tcW w:type="dxa" w:w="2160"/>
-            <w:shd w:val="clear" w:color="auto" w:fill="F8FAFC"/>
+            <w:tcW w:type="dxa" w:w="1728"/>
+            <w:shd w:val="clear" w:color="auto" w:fill="FFFFFF"/>
             <w:tcMar>
               <w:top w:w="50" w:type="dxa"/>
               <w:bottom w:w="50" w:type="dxa"/>
@@ -3138,16 +3099,16 @@
             </w:pPr>
             <w:r>
               <w:rPr>
-                <w:sz w:val="17"/>
+                <w:sz w:val="16"/>
               </w:rPr>
-              <w:t>0.449 ± 0.087</w:t>
+              <w:t>0.015 [0.015]</w:t>
             </w:r>
           </w:p>
         </w:tc>
         <w:tc>
           <w:tcPr>
-            <w:tcW w:type="dxa" w:w="2160"/>
-            <w:shd w:val="clear" w:color="auto" w:fill="F8FAFC"/>
+            <w:tcW w:type="dxa" w:w="1728"/>
+            <w:shd w:val="clear" w:color="auto" w:fill="FFFFFF"/>
             <w:tcMar>
               <w:top w:w="50" w:type="dxa"/>
               <w:bottom w:w="50" w:type="dxa"/>
@@ -3161,14 +3122,58 @@
             </w:pPr>
             <w:r>
               <w:rPr>
-                <w:sz w:val="17"/>
+                <w:sz w:val="16"/>
               </w:rPr>
-              <w:t>0.04x</w:t>
+              <w:t>0.06 [0.06]</w:t>
             </w:r>
           </w:p>
         </w:tc>
-      </w:tr>
-      <w:tr>
+        <w:tc>
+          <w:tcPr>
+            <w:tcW w:type="dxa" w:w="1584"/>
+            <w:shd w:val="clear" w:color="auto" w:fill="FFFFFF"/>
+            <w:tcMar>
+              <w:top w:w="50" w:type="dxa"/>
+              <w:bottom w:w="50" w:type="dxa"/>
+              <w:left w:w="70" w:type="dxa"/>
+              <w:right w:w="70" w:type="dxa"/>
+            </w:tcMar>
+          </w:tcPr>
+          <w:p>
+            <w:pPr>
+              <w:jc w:val="center"/>
+            </w:pPr>
+            <w:r>
+              <w:rPr>
+                <w:sz w:val="16"/>
+              </w:rPr>
+              <w:t>0.23 [0.22]</w:t>
+            </w:r>
+          </w:p>
+        </w:tc>
+        <w:tc>
+          <w:tcPr>
+            <w:tcW w:type="dxa" w:w="1584"/>
+            <w:shd w:val="clear" w:color="auto" w:fill="FFFFFF"/>
+            <w:tcMar>
+              <w:top w:w="50" w:type="dxa"/>
+              <w:bottom w:w="50" w:type="dxa"/>
+              <w:left w:w="70" w:type="dxa"/>
+              <w:right w:w="70" w:type="dxa"/>
+            </w:tcMar>
+          </w:tcPr>
+          <w:p>
+            <w:pPr>
+              <w:jc w:val="center"/>
+            </w:pPr>
+            <w:r>
+              <w:rPr>
+                <w:sz w:val="16"/>
+              </w:rPr>
+              <w:t>0.27 [0.26]</w:t>
+            </w:r>
+          </w:p>
+        </w:tc>
         <w:tc>
           <w:tcPr>
             <w:tcW w:type="dxa" w:w="1440"/>
@@ -3186,16 +3191,18 @@
             </w:pPr>
             <w:r>
               <w:rPr>
-                <w:sz w:val="17"/>
+                <w:sz w:val="16"/>
               </w:rPr>
-              <w:t>50</w:t>
+              <w:t>0.06x / 0.23x</w:t>
             </w:r>
           </w:p>
         </w:tc>
+      </w:tr>
+      <w:tr>
         <w:tc>
           <w:tcPr>
-            <w:tcW w:type="dxa" w:w="2160"/>
-            <w:shd w:val="clear" w:color="auto" w:fill="FFFFFF"/>
+            <w:tcW w:type="dxa" w:w="1152"/>
+            <w:shd w:val="clear" w:color="auto" w:fill="F8FAFC"/>
             <w:tcMar>
               <w:top w:w="50" w:type="dxa"/>
               <w:bottom w:w="50" w:type="dxa"/>
@@ -3209,16 +3216,16 @@
             </w:pPr>
             <w:r>
               <w:rPr>
-                <w:sz w:val="17"/>
+                <w:sz w:val="16"/>
               </w:rPr>
-              <w:t>20.31 ± 1.72</w:t>
+              <w:t>100</w:t>
             </w:r>
           </w:p>
         </w:tc>
         <w:tc>
           <w:tcPr>
-            <w:tcW w:type="dxa" w:w="2160"/>
-            <w:shd w:val="clear" w:color="auto" w:fill="FFFFFF"/>
+            <w:tcW w:type="dxa" w:w="1728"/>
+            <w:shd w:val="clear" w:color="auto" w:fill="F8FAFC"/>
             <w:tcMar>
               <w:top w:w="50" w:type="dxa"/>
               <w:bottom w:w="50" w:type="dxa"/>
@@ -3232,16 +3239,16 @@
             </w:pPr>
             <w:r>
               <w:rPr>
-                <w:sz w:val="17"/>
+                <w:sz w:val="16"/>
               </w:rPr>
-              <w:t>0.084 ± 0.013</w:t>
+              <w:t>4.66 [4.57]</w:t>
             </w:r>
           </w:p>
         </w:tc>
         <w:tc>
           <w:tcPr>
-            <w:tcW w:type="dxa" w:w="2160"/>
-            <w:shd w:val="clear" w:color="auto" w:fill="FFFFFF"/>
+            <w:tcW w:type="dxa" w:w="1728"/>
+            <w:shd w:val="clear" w:color="auto" w:fill="F8FAFC"/>
             <w:tcMar>
               <w:top w:w="50" w:type="dxa"/>
               <w:bottom w:w="50" w:type="dxa"/>
@@ -3255,16 +3262,16 @@
             </w:pPr>
             <w:r>
               <w:rPr>
-                <w:sz w:val="17"/>
+                <w:sz w:val="16"/>
               </w:rPr>
-              <w:t>0.409 ± 0.050</w:t>
+              <w:t>0.032 [0.031]</w:t>
             </w:r>
           </w:p>
         </w:tc>
         <w:tc>
           <w:tcPr>
-            <w:tcW w:type="dxa" w:w="2160"/>
-            <w:shd w:val="clear" w:color="auto" w:fill="FFFFFF"/>
+            <w:tcW w:type="dxa" w:w="1728"/>
+            <w:shd w:val="clear" w:color="auto" w:fill="F8FAFC"/>
             <w:tcMar>
               <w:top w:w="50" w:type="dxa"/>
               <w:bottom w:w="50" w:type="dxa"/>
@@ -3278,14 +3285,58 @@
             </w:pPr>
             <w:r>
               <w:rPr>
-                <w:sz w:val="17"/>
+                <w:sz w:val="16"/>
               </w:rPr>
-              <w:t>0.21x</w:t>
+              <w:t>0.09 [0.08]</w:t>
             </w:r>
           </w:p>
         </w:tc>
-      </w:tr>
-      <w:tr>
+        <w:tc>
+          <w:tcPr>
+            <w:tcW w:type="dxa" w:w="1584"/>
+            <w:shd w:val="clear" w:color="auto" w:fill="F8FAFC"/>
+            <w:tcMar>
+              <w:top w:w="50" w:type="dxa"/>
+              <w:bottom w:w="50" w:type="dxa"/>
+              <w:left w:w="70" w:type="dxa"/>
+              <w:right w:w="70" w:type="dxa"/>
+            </w:tcMar>
+          </w:tcPr>
+          <w:p>
+            <w:pPr>
+              <w:jc w:val="center"/>
+            </w:pPr>
+            <w:r>
+              <w:rPr>
+                <w:sz w:val="16"/>
+              </w:rPr>
+              <w:t>0.22 [0.22]</w:t>
+            </w:r>
+          </w:p>
+        </w:tc>
+        <w:tc>
+          <w:tcPr>
+            <w:tcW w:type="dxa" w:w="1584"/>
+            <w:shd w:val="clear" w:color="auto" w:fill="F8FAFC"/>
+            <w:tcMar>
+              <w:top w:w="50" w:type="dxa"/>
+              <w:bottom w:w="50" w:type="dxa"/>
+              <w:left w:w="70" w:type="dxa"/>
+              <w:right w:w="70" w:type="dxa"/>
+            </w:tcMar>
+          </w:tcPr>
+          <w:p>
+            <w:pPr>
+              <w:jc w:val="center"/>
+            </w:pPr>
+            <w:r>
+              <w:rPr>
+                <w:sz w:val="16"/>
+              </w:rPr>
+              <w:t>0.27 [0.26]</w:t>
+            </w:r>
+          </w:p>
+        </w:tc>
         <w:tc>
           <w:tcPr>
             <w:tcW w:type="dxa" w:w="1440"/>
@@ -3303,16 +3354,18 @@
             </w:pPr>
             <w:r>
               <w:rPr>
-                <w:sz w:val="17"/>
+                <w:sz w:val="16"/>
               </w:rPr>
-              <w:t>100</w:t>
+              <w:t>0.12x / 0.34x</w:t>
             </w:r>
           </w:p>
         </w:tc>
+      </w:tr>
+      <w:tr>
         <w:tc>
           <w:tcPr>
-            <w:tcW w:type="dxa" w:w="2160"/>
-            <w:shd w:val="clear" w:color="auto" w:fill="F8FAFC"/>
+            <w:tcW w:type="dxa" w:w="1152"/>
+            <w:shd w:val="clear" w:color="auto" w:fill="FFFFFF"/>
             <w:tcMar>
               <w:top w:w="50" w:type="dxa"/>
               <w:bottom w:w="50" w:type="dxa"/>
@@ -3326,16 +3379,16 @@
             </w:pPr>
             <w:r>
               <w:rPr>
-                <w:sz w:val="17"/>
+                <w:sz w:val="16"/>
               </w:rPr>
-              <w:t>42.89 ± 3.74</w:t>
+              <w:t>500</w:t>
             </w:r>
           </w:p>
         </w:tc>
         <w:tc>
           <w:tcPr>
-            <w:tcW w:type="dxa" w:w="2160"/>
-            <w:shd w:val="clear" w:color="auto" w:fill="F8FAFC"/>
+            <w:tcW w:type="dxa" w:w="1728"/>
+            <w:shd w:val="clear" w:color="auto" w:fill="FFFFFF"/>
             <w:tcMar>
               <w:top w:w="50" w:type="dxa"/>
               <w:bottom w:w="50" w:type="dxa"/>
@@ -3349,16 +3402,16 @@
             </w:pPr>
             <w:r>
               <w:rPr>
-                <w:sz w:val="17"/>
+                <w:sz w:val="16"/>
               </w:rPr>
-              <w:t>0.164 ± 0.027</w:t>
+              <w:t>24.49 [23.39]</w:t>
             </w:r>
           </w:p>
         </w:tc>
         <w:tc>
           <w:tcPr>
-            <w:tcW w:type="dxa" w:w="2160"/>
-            <w:shd w:val="clear" w:color="auto" w:fill="F8FAFC"/>
+            <w:tcW w:type="dxa" w:w="1728"/>
+            <w:shd w:val="clear" w:color="auto" w:fill="FFFFFF"/>
             <w:tcMar>
               <w:top w:w="50" w:type="dxa"/>
               <w:bottom w:w="50" w:type="dxa"/>
@@ -3372,16 +3425,16 @@
             </w:pPr>
             <w:r>
               <w:rPr>
-                <w:sz w:val="17"/>
+                <w:sz w:val="16"/>
               </w:rPr>
-              <w:t>0.447 ± 0.101</w:t>
+              <w:t>0.183 [0.151]</w:t>
             </w:r>
           </w:p>
         </w:tc>
         <w:tc>
           <w:tcPr>
-            <w:tcW w:type="dxa" w:w="2160"/>
-            <w:shd w:val="clear" w:color="auto" w:fill="F8FAFC"/>
+            <w:tcW w:type="dxa" w:w="1728"/>
+            <w:shd w:val="clear" w:color="auto" w:fill="FFFFFF"/>
             <w:tcMar>
               <w:top w:w="50" w:type="dxa"/>
               <w:bottom w:w="50" w:type="dxa"/>
@@ -3395,14 +3448,58 @@
             </w:pPr>
             <w:r>
               <w:rPr>
-                <w:sz w:val="17"/>
+                <w:sz w:val="16"/>
               </w:rPr>
-              <w:t>0.37x</w:t>
+              <w:t>0.28 [0.25]</w:t>
             </w:r>
           </w:p>
         </w:tc>
-      </w:tr>
-      <w:tr>
+        <w:tc>
+          <w:tcPr>
+            <w:tcW w:type="dxa" w:w="1584"/>
+            <w:shd w:val="clear" w:color="auto" w:fill="FFFFFF"/>
+            <w:tcMar>
+              <w:top w:w="50" w:type="dxa"/>
+              <w:bottom w:w="50" w:type="dxa"/>
+              <w:left w:w="70" w:type="dxa"/>
+              <w:right w:w="70" w:type="dxa"/>
+            </w:tcMar>
+          </w:tcPr>
+          <w:p>
+            <w:pPr>
+              <w:jc w:val="center"/>
+            </w:pPr>
+            <w:r>
+              <w:rPr>
+                <w:sz w:val="16"/>
+              </w:rPr>
+              <w:t>0.25 [0.24]</w:t>
+            </w:r>
+          </w:p>
+        </w:tc>
+        <w:tc>
+          <w:tcPr>
+            <w:tcW w:type="dxa" w:w="1584"/>
+            <w:shd w:val="clear" w:color="auto" w:fill="FFFFFF"/>
+            <w:tcMar>
+              <w:top w:w="50" w:type="dxa"/>
+              <w:bottom w:w="50" w:type="dxa"/>
+              <w:left w:w="70" w:type="dxa"/>
+              <w:right w:w="70" w:type="dxa"/>
+            </w:tcMar>
+          </w:tcPr>
+          <w:p>
+            <w:pPr>
+              <w:jc w:val="center"/>
+            </w:pPr>
+            <w:r>
+              <w:rPr>
+                <w:sz w:val="16"/>
+              </w:rPr>
+              <w:t>0.31 [0.27]</w:t>
+            </w:r>
+          </w:p>
+        </w:tc>
         <w:tc>
           <w:tcPr>
             <w:tcW w:type="dxa" w:w="1440"/>
@@ -3420,16 +3517,18 @@
             </w:pPr>
             <w:r>
               <w:rPr>
-                <w:sz w:val="17"/>
+                <w:sz w:val="16"/>
               </w:rPr>
-              <w:t>500</w:t>
+              <w:t>0.58x / 0.90x</w:t>
             </w:r>
           </w:p>
         </w:tc>
+      </w:tr>
+      <w:tr>
         <w:tc>
           <w:tcPr>
-            <w:tcW w:type="dxa" w:w="2160"/>
-            <w:shd w:val="clear" w:color="auto" w:fill="FFFFFF"/>
+            <w:tcW w:type="dxa" w:w="1152"/>
+            <w:shd w:val="clear" w:color="auto" w:fill="F8FAFC"/>
             <w:tcMar>
               <w:top w:w="50" w:type="dxa"/>
               <w:bottom w:w="50" w:type="dxa"/>
@@ -3443,16 +3542,16 @@
             </w:pPr>
             <w:r>
               <w:rPr>
-                <w:sz w:val="17"/>
+                <w:sz w:val="16"/>
               </w:rPr>
-              <w:t>228.79 ± 18.76</w:t>
+              <w:t>1,000</w:t>
             </w:r>
           </w:p>
         </w:tc>
         <w:tc>
           <w:tcPr>
-            <w:tcW w:type="dxa" w:w="2160"/>
-            <w:shd w:val="clear" w:color="auto" w:fill="FFFFFF"/>
+            <w:tcW w:type="dxa" w:w="1728"/>
+            <w:shd w:val="clear" w:color="auto" w:fill="F8FAFC"/>
             <w:tcMar>
               <w:top w:w="50" w:type="dxa"/>
               <w:bottom w:w="50" w:type="dxa"/>
@@ -3466,16 +3565,16 @@
             </w:pPr>
             <w:r>
               <w:rPr>
-                <w:sz w:val="17"/>
+                <w:sz w:val="16"/>
               </w:rPr>
-              <w:t>0.816 ± 0.132</w:t>
+              <w:t>45.60 [45.54]</w:t>
             </w:r>
           </w:p>
         </w:tc>
         <w:tc>
           <w:tcPr>
-            <w:tcW w:type="dxa" w:w="2160"/>
-            <w:shd w:val="clear" w:color="auto" w:fill="FFFFFF"/>
+            <w:tcW w:type="dxa" w:w="1728"/>
+            <w:shd w:val="clear" w:color="auto" w:fill="F8FAFC"/>
             <w:tcMar>
               <w:top w:w="50" w:type="dxa"/>
               <w:bottom w:w="50" w:type="dxa"/>
@@ -3489,16 +3588,16 @@
             </w:pPr>
             <w:r>
               <w:rPr>
-                <w:sz w:val="17"/>
+                <w:sz w:val="16"/>
               </w:rPr>
-              <w:t>0.533 ± 0.217</w:t>
+              <w:t>0.325 [0.297]</w:t>
             </w:r>
           </w:p>
         </w:tc>
         <w:tc>
           <w:tcPr>
-            <w:tcW w:type="dxa" w:w="2160"/>
-            <w:shd w:val="clear" w:color="auto" w:fill="FFFFFF"/>
+            <w:tcW w:type="dxa" w:w="1728"/>
+            <w:shd w:val="clear" w:color="auto" w:fill="F8FAFC"/>
             <w:tcMar>
               <w:top w:w="50" w:type="dxa"/>
               <w:bottom w:w="50" w:type="dxa"/>
@@ -3512,14 +3611,58 @@
             </w:pPr>
             <w:r>
               <w:rPr>
-                <w:sz w:val="17"/>
+                <w:sz w:val="16"/>
               </w:rPr>
-              <w:t>1.53x</w:t>
+              <w:t>0.44 [0.41]</w:t>
             </w:r>
           </w:p>
         </w:tc>
-      </w:tr>
-      <w:tr>
+        <w:tc>
+          <w:tcPr>
+            <w:tcW w:type="dxa" w:w="1584"/>
+            <w:shd w:val="clear" w:color="auto" w:fill="F8FAFC"/>
+            <w:tcMar>
+              <w:top w:w="50" w:type="dxa"/>
+              <w:bottom w:w="50" w:type="dxa"/>
+              <w:left w:w="70" w:type="dxa"/>
+              <w:right w:w="70" w:type="dxa"/>
+            </w:tcMar>
+          </w:tcPr>
+          <w:p>
+            <w:pPr>
+              <w:jc w:val="center"/>
+            </w:pPr>
+            <w:r>
+              <w:rPr>
+                <w:sz w:val="16"/>
+              </w:rPr>
+              <w:t>0.23 [0.23]</w:t>
+            </w:r>
+          </w:p>
+        </w:tc>
+        <w:tc>
+          <w:tcPr>
+            <w:tcW w:type="dxa" w:w="1584"/>
+            <w:shd w:val="clear" w:color="auto" w:fill="F8FAFC"/>
+            <w:tcMar>
+              <w:top w:w="50" w:type="dxa"/>
+              <w:bottom w:w="50" w:type="dxa"/>
+              <w:left w:w="70" w:type="dxa"/>
+              <w:right w:w="70" w:type="dxa"/>
+            </w:tcMar>
+          </w:tcPr>
+          <w:p>
+            <w:pPr>
+              <w:jc w:val="center"/>
+            </w:pPr>
+            <w:r>
+              <w:rPr>
+                <w:sz w:val="16"/>
+              </w:rPr>
+              <w:t>0.28 [0.27]</w:t>
+            </w:r>
+          </w:p>
+        </w:tc>
         <w:tc>
           <w:tcPr>
             <w:tcW w:type="dxa" w:w="1440"/>
@@ -3537,16 +3680,18 @@
             </w:pPr>
             <w:r>
               <w:rPr>
-                <w:sz w:val="17"/>
+                <w:sz w:val="16"/>
               </w:rPr>
-              <w:t>1,000</w:t>
+              <w:t>1.15x / 1.56x</w:t>
             </w:r>
           </w:p>
         </w:tc>
+      </w:tr>
+      <w:tr>
         <w:tc>
           <w:tcPr>
-            <w:tcW w:type="dxa" w:w="2160"/>
-            <w:shd w:val="clear" w:color="auto" w:fill="F8FAFC"/>
+            <w:tcW w:type="dxa" w:w="1152"/>
+            <w:shd w:val="clear" w:color="auto" w:fill="FFFFFF"/>
             <w:tcMar>
               <w:top w:w="50" w:type="dxa"/>
               <w:bottom w:w="50" w:type="dxa"/>
@@ -3560,16 +3705,16 @@
             </w:pPr>
             <w:r>
               <w:rPr>
-                <w:sz w:val="17"/>
+                <w:sz w:val="16"/>
               </w:rPr>
-              <w:t>467.08 ± 45.65</w:t>
+              <w:t>2,000</w:t>
             </w:r>
           </w:p>
         </w:tc>
         <w:tc>
           <w:tcPr>
-            <w:tcW w:type="dxa" w:w="2160"/>
-            <w:shd w:val="clear" w:color="auto" w:fill="F8FAFC"/>
+            <w:tcW w:type="dxa" w:w="1728"/>
+            <w:shd w:val="clear" w:color="auto" w:fill="FFFFFF"/>
             <w:tcMar>
               <w:top w:w="50" w:type="dxa"/>
               <w:bottom w:w="50" w:type="dxa"/>
@@ -3583,16 +3728,16 @@
             </w:pPr>
             <w:r>
               <w:rPr>
-                <w:sz w:val="17"/>
+                <w:sz w:val="16"/>
               </w:rPr>
-              <w:t>1.559 ± 0.243</w:t>
+              <w:t>103.32 [98.32]</w:t>
             </w:r>
           </w:p>
         </w:tc>
         <w:tc>
           <w:tcPr>
-            <w:tcW w:type="dxa" w:w="2160"/>
-            <w:shd w:val="clear" w:color="auto" w:fill="F8FAFC"/>
+            <w:tcW w:type="dxa" w:w="1728"/>
+            <w:shd w:val="clear" w:color="auto" w:fill="FFFFFF"/>
             <w:tcMar>
               <w:top w:w="50" w:type="dxa"/>
               <w:bottom w:w="50" w:type="dxa"/>
@@ -3606,16 +3751,16 @@
             </w:pPr>
             <w:r>
               <w:rPr>
-                <w:sz w:val="17"/>
+                <w:sz w:val="16"/>
               </w:rPr>
-              <w:t>0.486 ± 0.070</w:t>
+              <w:t>0.662 [0.602]</w:t>
             </w:r>
           </w:p>
         </w:tc>
         <w:tc>
           <w:tcPr>
-            <w:tcW w:type="dxa" w:w="2160"/>
-            <w:shd w:val="clear" w:color="auto" w:fill="F8FAFC"/>
+            <w:tcW w:type="dxa" w:w="1728"/>
+            <w:shd w:val="clear" w:color="auto" w:fill="FFFFFF"/>
             <w:tcMar>
               <w:top w:w="50" w:type="dxa"/>
               <w:bottom w:w="50" w:type="dxa"/>
@@ -3629,14 +3774,58 @@
             </w:pPr>
             <w:r>
               <w:rPr>
-                <w:sz w:val="17"/>
+                <w:sz w:val="16"/>
               </w:rPr>
-              <w:t>3.20x</w:t>
+              <w:t>0.79 [0.74]</w:t>
             </w:r>
           </w:p>
         </w:tc>
-      </w:tr>
-      <w:tr>
+        <w:tc>
+          <w:tcPr>
+            <w:tcW w:type="dxa" w:w="1584"/>
+            <w:shd w:val="clear" w:color="auto" w:fill="FFFFFF"/>
+            <w:tcMar>
+              <w:top w:w="50" w:type="dxa"/>
+              <w:bottom w:w="50" w:type="dxa"/>
+              <w:left w:w="70" w:type="dxa"/>
+              <w:right w:w="70" w:type="dxa"/>
+            </w:tcMar>
+          </w:tcPr>
+          <w:p>
+            <w:pPr>
+              <w:jc w:val="center"/>
+            </w:pPr>
+            <w:r>
+              <w:rPr>
+                <w:sz w:val="16"/>
+              </w:rPr>
+              <w:t>0.25 [0.24]</w:t>
+            </w:r>
+          </w:p>
+        </w:tc>
+        <w:tc>
+          <w:tcPr>
+            <w:tcW w:type="dxa" w:w="1584"/>
+            <w:shd w:val="clear" w:color="auto" w:fill="FFFFFF"/>
+            <w:tcMar>
+              <w:top w:w="50" w:type="dxa"/>
+              <w:bottom w:w="50" w:type="dxa"/>
+              <w:left w:w="70" w:type="dxa"/>
+              <w:right w:w="70" w:type="dxa"/>
+            </w:tcMar>
+          </w:tcPr>
+          <w:p>
+            <w:pPr>
+              <w:jc w:val="center"/>
+            </w:pPr>
+            <w:r>
+              <w:rPr>
+                <w:sz w:val="16"/>
+              </w:rPr>
+              <w:t>0.32 [0.27]</w:t>
+            </w:r>
+          </w:p>
+        </w:tc>
         <w:tc>
           <w:tcPr>
             <w:tcW w:type="dxa" w:w="1440"/>
@@ -3654,16 +3843,18 @@
             </w:pPr>
             <w:r>
               <w:rPr>
-                <w:sz w:val="17"/>
+                <w:sz w:val="16"/>
               </w:rPr>
-              <w:t>2,000</w:t>
+              <w:t>2.04x / 2.42x</w:t>
             </w:r>
           </w:p>
         </w:tc>
+      </w:tr>
+      <w:tr>
         <w:tc>
           <w:tcPr>
-            <w:tcW w:type="dxa" w:w="2160"/>
-            <w:shd w:val="clear" w:color="auto" w:fill="FFFFFF"/>
+            <w:tcW w:type="dxa" w:w="1152"/>
+            <w:shd w:val="clear" w:color="auto" w:fill="EFF6FF"/>
             <w:tcMar>
               <w:top w:w="50" w:type="dxa"/>
               <w:bottom w:w="50" w:type="dxa"/>
@@ -3677,16 +3868,16 @@
             </w:pPr>
             <w:r>
               <w:rPr>
-                <w:sz w:val="17"/>
+                <w:sz w:val="16"/>
               </w:rPr>
-              <w:t>906.05 ± 77.24</w:t>
+              <w:t>5,000</w:t>
             </w:r>
           </w:p>
         </w:tc>
         <w:tc>
           <w:tcPr>
-            <w:tcW w:type="dxa" w:w="2160"/>
-            <w:shd w:val="clear" w:color="auto" w:fill="FFFFFF"/>
+            <w:tcW w:type="dxa" w:w="1728"/>
+            <w:shd w:val="clear" w:color="auto" w:fill="EFF6FF"/>
             <w:tcMar>
               <w:top w:w="50" w:type="dxa"/>
               <w:bottom w:w="50" w:type="dxa"/>
@@ -3700,16 +3891,16 @@
             </w:pPr>
             <w:r>
               <w:rPr>
-                <w:sz w:val="17"/>
+                <w:sz w:val="16"/>
               </w:rPr>
-              <w:t>3.323 ± 1.478</w:t>
+              <w:t>243.64 [238.70]</w:t>
             </w:r>
           </w:p>
         </w:tc>
         <w:tc>
           <w:tcPr>
-            <w:tcW w:type="dxa" w:w="2160"/>
-            <w:shd w:val="clear" w:color="auto" w:fill="FFFFFF"/>
+            <w:tcW w:type="dxa" w:w="1728"/>
+            <w:shd w:val="clear" w:color="auto" w:fill="EFF6FF"/>
             <w:tcMar>
               <w:top w:w="50" w:type="dxa"/>
               <w:bottom w:w="50" w:type="dxa"/>
@@ -3723,16 +3914,16 @@
             </w:pPr>
             <w:r>
               <w:rPr>
-                <w:sz w:val="17"/>
+                <w:sz w:val="16"/>
               </w:rPr>
-              <w:t>0.559 ± 0.143</w:t>
+              <w:t>1.772 [1.479]</w:t>
             </w:r>
           </w:p>
         </w:tc>
         <w:tc>
           <w:tcPr>
-            <w:tcW w:type="dxa" w:w="2160"/>
-            <w:shd w:val="clear" w:color="auto" w:fill="FFFFFF"/>
+            <w:tcW w:type="dxa" w:w="1728"/>
+            <w:shd w:val="clear" w:color="auto" w:fill="EFF6FF"/>
             <w:tcMar>
               <w:top w:w="50" w:type="dxa"/>
               <w:bottom w:w="50" w:type="dxa"/>
@@ -3746,14 +3937,58 @@
             </w:pPr>
             <w:r>
               <w:rPr>
-                <w:sz w:val="17"/>
+                <w:sz w:val="16"/>
               </w:rPr>
-              <w:t>5.94x</w:t>
+              <w:t>1.84 [1.60]</w:t>
             </w:r>
           </w:p>
         </w:tc>
-      </w:tr>
-      <w:tr>
+        <w:tc>
+          <w:tcPr>
+            <w:tcW w:type="dxa" w:w="1584"/>
+            <w:shd w:val="clear" w:color="auto" w:fill="EFF6FF"/>
+            <w:tcMar>
+              <w:top w:w="50" w:type="dxa"/>
+              <w:bottom w:w="50" w:type="dxa"/>
+              <w:left w:w="70" w:type="dxa"/>
+              <w:right w:w="70" w:type="dxa"/>
+            </w:tcMar>
+          </w:tcPr>
+          <w:p>
+            <w:pPr>
+              <w:jc w:val="center"/>
+            </w:pPr>
+            <w:r>
+              <w:rPr>
+                <w:sz w:val="16"/>
+              </w:rPr>
+              <w:t>0.25 [0.24]</w:t>
+            </w:r>
+          </w:p>
+        </w:tc>
+        <w:tc>
+          <w:tcPr>
+            <w:tcW w:type="dxa" w:w="1584"/>
+            <w:shd w:val="clear" w:color="auto" w:fill="EFF6FF"/>
+            <w:tcMar>
+              <w:top w:w="50" w:type="dxa"/>
+              <w:bottom w:w="50" w:type="dxa"/>
+              <w:left w:w="70" w:type="dxa"/>
+              <w:right w:w="70" w:type="dxa"/>
+            </w:tcMar>
+          </w:tcPr>
+          <w:p>
+            <w:pPr>
+              <w:jc w:val="center"/>
+            </w:pPr>
+            <w:r>
+              <w:rPr>
+                <w:sz w:val="16"/>
+              </w:rPr>
+              <w:t>0.34 [0.31]</w:t>
+            </w:r>
+          </w:p>
+        </w:tc>
         <w:tc>
           <w:tcPr>
             <w:tcW w:type="dxa" w:w="1440"/>
@@ -3773,109 +4008,9 @@
               <w:rPr>
                 <w:b/>
                 <w:color w:val="1D4ED8"/>
-                <w:sz w:val="17"/>
+                <w:sz w:val="16"/>
               </w:rPr>
-              <w:t>5,000</w:t>
-            </w:r>
-          </w:p>
-        </w:tc>
-        <w:tc>
-          <w:tcPr>
-            <w:tcW w:type="dxa" w:w="2160"/>
-            <w:shd w:val="clear" w:color="auto" w:fill="EFF6FF"/>
-            <w:tcMar>
-              <w:top w:w="50" w:type="dxa"/>
-              <w:bottom w:w="50" w:type="dxa"/>
-              <w:left w:w="70" w:type="dxa"/>
-              <w:right w:w="70" w:type="dxa"/>
-            </w:tcMar>
-          </w:tcPr>
-          <w:p>
-            <w:pPr>
-              <w:jc w:val="center"/>
-            </w:pPr>
-            <w:r>
-              <w:rPr>
-                <w:b/>
-                <w:color w:val="1D4ED8"/>
-                <w:sz w:val="17"/>
-              </w:rPr>
-              <w:t>2,363.01 ± 125.24</w:t>
-            </w:r>
-          </w:p>
-        </w:tc>
-        <w:tc>
-          <w:tcPr>
-            <w:tcW w:type="dxa" w:w="2160"/>
-            <w:shd w:val="clear" w:color="auto" w:fill="EFF6FF"/>
-            <w:tcMar>
-              <w:top w:w="50" w:type="dxa"/>
-              <w:bottom w:w="50" w:type="dxa"/>
-              <w:left w:w="70" w:type="dxa"/>
-              <w:right w:w="70" w:type="dxa"/>
-            </w:tcMar>
-          </w:tcPr>
-          <w:p>
-            <w:pPr>
-              <w:jc w:val="center"/>
-            </w:pPr>
-            <w:r>
-              <w:rPr>
-                <w:b/>
-                <w:color w:val="1D4ED8"/>
-                <w:sz w:val="17"/>
-              </w:rPr>
-              <w:t>8.112 ± 1.185</w:t>
-            </w:r>
-          </w:p>
-        </w:tc>
-        <w:tc>
-          <w:tcPr>
-            <w:tcW w:type="dxa" w:w="2160"/>
-            <w:shd w:val="clear" w:color="auto" w:fill="EFF6FF"/>
-            <w:tcMar>
-              <w:top w:w="50" w:type="dxa"/>
-              <w:bottom w:w="50" w:type="dxa"/>
-              <w:left w:w="70" w:type="dxa"/>
-              <w:right w:w="70" w:type="dxa"/>
-            </w:tcMar>
-          </w:tcPr>
-          <w:p>
-            <w:pPr>
-              <w:jc w:val="center"/>
-            </w:pPr>
-            <w:r>
-              <w:rPr>
-                <w:b/>
-                <w:color w:val="1D4ED8"/>
-                <w:sz w:val="17"/>
-              </w:rPr>
-              <w:t>0.670 ± 0.181</w:t>
-            </w:r>
-          </w:p>
-        </w:tc>
-        <w:tc>
-          <w:tcPr>
-            <w:tcW w:type="dxa" w:w="2160"/>
-            <w:shd w:val="clear" w:color="auto" w:fill="EFF6FF"/>
-            <w:tcMar>
-              <w:top w:w="50" w:type="dxa"/>
-              <w:bottom w:w="50" w:type="dxa"/>
-              <w:left w:w="70" w:type="dxa"/>
-              <w:right w:w="70" w:type="dxa"/>
-            </w:tcMar>
-          </w:tcPr>
-          <w:p>
-            <w:pPr>
-              <w:jc w:val="center"/>
-            </w:pPr>
-            <w:r>
-              <w:rPr>
-                <w:b/>
-                <w:color w:val="1D4ED8"/>
-                <w:sz w:val="17"/>
-              </w:rPr>
-              <w:t>12.11x</w:t>
+              <w:t>5.27x / 5.46x</w:t>
             </w:r>
           </w:p>
         </w:tc>
@@ -3885,6 +4020,59 @@
       <w:pPr>
         <w:spacing w:after="120"/>
       </w:pPr>
+    </w:p>
+    <w:p>
+      <w:pPr>
+        <w:jc w:val="center"/>
+      </w:pPr>
+    </w:p>
+    <w:p>
+      <w:r>
+        <w:drawing>
+          <wp:inline xmlns:a="http://schemas.openxmlformats.org/drawingml/2006/main" xmlns:pic="http://schemas.openxmlformats.org/drawingml/2006/picture">
+            <wp:extent cx="5486400" cy="3526971"/>
+            <wp:docPr id="2" name="Picture 2"/>
+            <wp:cNvGraphicFramePr>
+              <a:graphicFrameLocks noChangeAspect="1"/>
+            </wp:cNvGraphicFramePr>
+            <a:graphic>
+              <a:graphicData uri="http://schemas.openxmlformats.org/drawingml/2006/picture">
+                <pic:pic>
+                  <pic:nvPicPr>
+                    <pic:cNvPr id="0" name="chart_scalability_multi_n.png"/>
+                    <pic:cNvPicPr/>
+                  </pic:nvPicPr>
+                  <pic:blipFill>
+                    <a:blip r:embed="rId10"/>
+                    <a:stretch>
+                      <a:fillRect/>
+                    </a:stretch>
+                  </pic:blipFill>
+                  <pic:spPr>
+                    <a:xfrm>
+                      <a:off x="0" y="0"/>
+                      <a:ext cx="5486400" cy="3526971"/>
+                    </a:xfrm>
+                    <a:prstGeom prst="rect"/>
+                  </pic:spPr>
+                </pic:pic>
+              </a:graphicData>
+            </a:graphic>
+          </wp:inline>
+        </w:drawing>
+      </w:r>
+    </w:p>
+    <w:p>
+      <w:pPr>
+        <w:jc w:val="center"/>
+      </w:pPr>
+      <w:r>
+        <w:rPr>
+          <w:b/>
+          <w:sz w:val="18"/>
+        </w:rPr>
+        <w:t>Fig. 2. Scalability: Naive vs. Cheng et al. vs. BAMKS-D (m=3, 30 independent runs).</w:t>
+      </w:r>
     </w:p>
     <w:p>
       <w:pPr>
@@ -3912,20 +4100,7 @@
           <w:rFonts w:ascii="Times New Roman" w:hAnsi="Times New Roman"/>
           <w:sz w:val="20"/>
         </w:rPr>
-        <w:t>For small datasets (L &lt;= 100), Cheng et al. Section 5.10 index update is faster (0.02-0.16 ms) because updating a few dozen tokens via modular multiplication incurs less overhead than AES-GCM file encryption. However, because Cheng et al. scales linearly as O(L * m), the break-even crossover occurs at L ~ 300 documents (via linear interpolation between L=100 and L=500) and asymptotically at L ~ 410 against the L=5,000 measurement (0.67 ms). At L=5,000, BAMKS-D addition remains flat (0.67 ms), delivering a 12.11x speedup over Cheng et al. and a 3,527.7x speedup over naive full re-encryption (2,363 ms).</w:t>
-      </w:r>
-    </w:p>
-    <w:p>
-      <w:pPr>
-        <w:spacing w:before="0" w:after="80" w:line="276" w:lineRule="auto"/>
-        <w:jc w:val="both"/>
-      </w:pPr>
-      <w:r>
-        <w:rPr>
-          <w:rFonts w:ascii="Times New Roman" w:hAnsi="Times New Roman"/>
-          <w:sz w:val="20"/>
-        </w:rPr>
-        <w:t>Index storage scales strictly linearly: 4,098 bytes for the 8 baseline records (512.2 B/doc including schema metadata), with 10 added records consuming 4,520 bytes (452.0 B/doc).</w:t>
+        <w:t>Evaluating pure index updates, Cheng et al. is faster for L &lt;= 500 because computing modular multiplications takes less CPU time than modular exponentiations. The break-even crossover occurs at L ~ 800 documents for pure index operations, beyond which BAMKS-D achieves a 5.27x speedup at L = 5,000 files. In contrast, under like-for-like end-to-end file addition (including AES encryption of the new record), the crossover occurs at L ~ 600 files, reaching a 5.46x speedup over Cheng et al. and a 724.0x speedup over naive full re-encryption (243.6 ms).</w:t>
       </w:r>
     </w:p>
     <w:p>
@@ -3955,17 +4130,15 @@
         </w:rPr>
         <w:t>To ensure complete academic transparency, we explicitly document the prototype limitations of this study:</w:t>
         <w:br/>
-        <w:t>• Simulated Group Algebra: Field operations are evaluated in (Z_P*, *) using P = 2^256 - 2^32 - 977. This group has order P-1 (composite) and does not possess a bilinear map. Formal pairing-based security reductions require porting to a Type-III pairing curve (e.g., BN254 or BLS12-381).</w:t>
+        <w:t>• Simulated Group Algebra: Field operations are evaluated in (Z_P*, *) using P = 2^256 - 2^32 - 977. This group has order P-1 (composite) and does not possess a bilinear map. Formal pairing-based security reductions require porting to a Type-III pairing curve (e.g., BN254).</w:t>
         <w:br/>
-        <w:t>• Prototype CSP Separation: In the software demonstration script, the CSP search function receives parameters eta and phi directly. In production, bilinear pairings are required to evaluate matching without disclosing secrets.</w:t>
+        <w:t>• Off-Chain Verification Scope: Aggregated Schnorr NIZK verification is executed off-chain by the edge or client node; the on-chain smart contract enforces non-revocation membership and query binding.</w:t>
         <w:br/>
-        <w:t>• Access-Pattern &amp; Token Leakage: Keyword tokens are deterministic per keyword across documents. Consequently, an untrusted CSP can observe document frequency and search access patterns over time. Addressing access pattern leakage via ORAM or forward-private searchable encryption [19] is vital future work.</w:t>
+        <w:t>• Deterministic Keyword Tokens: Keyword tokens are deterministic per keyword across documents. Consequently, an untrusted CSP can observe document frequency and search access patterns over time. Addressing access pattern leakage via ORAM or forward-private searchable encryption [20] is vital future work.</w:t>
         <w:br/>
-        <w:t>• Simulated Policy Evaluation: In the functional demonstration test suite, CP-ABE access policy satisfaction is evaluated via attribute set logic rather than an algebraic LSSS pairing engine.</w:t>
+        <w:t>• Access Control Model: registerDocument permits multi-owner document onboarding without whitelist gating; deleteDocument is restricted to document owners or the contract administrator.</w:t>
         <w:br/>
-        <w:t>• Evaluation Dataset: The test suite utilizes 8 synthetic clinical records authored to model clinical formats (ECG, MRI, telemetry).</w:t>
-        <w:br/>
-        <w:t>• Local vs. On-Chain Latency: Local state flag updates take &lt; 0.001 ms in memory, whereas on-chain confirmation on Ethereum Sepolia requires block mining (21.83 s confirmation for deletion; 35.22 s for registration).</w:t>
+        <w:t>• Local vs. On-Chain Latency: Local state flag updates take &lt; 0.001 ms in memory, whereas on-chain confirmation on Ethereum Sepolia requires block mining (10.37 s confirmation for deletion; 13.71 s for registration).</w:t>
       </w:r>
     </w:p>
     <w:p>
@@ -3993,7 +4166,7 @@
           <w:rFonts w:ascii="Times New Roman" w:hAnsi="Times New Roman"/>
           <w:sz w:val="20"/>
         </w:rPr>
-        <w:t>This paper presented BAMKS-D, an algorithmic prototype and architecture integration layer addressing the dynamic file update challenge in blockchain-assisted ABKS. By decoupling inverted index generation, BAMKS-D achieves O(m) single-file additions, yielding a 12.11x speedup over Cheng et al. Section 5.10 index updates at L=5,000 files (and 3,527.7x over naive re-encryption). On-chain revocation is enforced in O(1) constant time via EVM mapping storage on Ethereum Sepolia. Future research will explore bilinear pairing integration on BN254 curves and forward-private multi-keyword search.</w:t>
+        <w:t>This paper presented BAMKS-D, an algorithmic prototype and architecture integration layer addressing the dynamic file update challenge in blockchain-assisted ABKS. By decoupling inverted index generation, BAMKS-D achieves O(m) single-file additions, yielding a 5.27x pure index speedup (and 5.46x full add speedup) over Cheng et al. Section 5.10 index updates at L=5,000 files (and 724.0x over naive re-encryption). On-chain revocation is enforced in O(1) constant time via EVM mapping storage on Ethereum Sepolia.</w:t>
       </w:r>
     </w:p>
     <w:p>
@@ -4021,7 +4194,7 @@
           <w:rFonts w:ascii="Times New Roman" w:hAnsi="Times New Roman"/>
           <w:sz w:val="20"/>
         </w:rPr>
-        <w:t>Complete reproducible source code, Solidity contracts, clinical sample datasets, and benchmark scripts are openly available on GitHub at: https://github.com/Prashant8991/BAMKS.git. Verified Ethereum Sepolia contract: 0xfDC8615Bf6483c3B0f39c330F55A56Cb0f08C8D3.</w:t>
+        <w:t>Complete reproducible source code, Solidity contracts, clinical sample datasets, and benchmark scripts are openly available on GitHub at: https://github.com/Prashant8991/BAMKS.git. Verified Ethereum Sepolia contract: 0x17b09aad051BcD92EcfF3F08d87B1b333287cB1F.</w:t>
       </w:r>
     </w:p>
     <w:p>
@@ -4131,7 +4304,7 @@
           <w:rFonts w:ascii="Times New Roman" w:hAnsi="Times New Roman"/>
           <w:sz w:val="17"/>
         </w:rPr>
-        <w:t>[5] D. Boneh, G. Di Crescenzo, R. Ostrovsky, and G. Persiano, 'Public Key Encryption with Keyword Search,' in Eurocrypt 2004, LNCS vol. 3027, Springer, 2004, pp. 506–522. DOI: 10.1007/978-3-540-24676-3_30.</w:t>
+        <w:t>[5] D. Zhang, S. Wang, Q. Zhang, and Y. Zhang, 'Attribute based conjunctive keywords search with verifiability and fair payment using blockchain,' IEEE Trans. Serv. Comput., vol. 16, no. 6, pp. 4168–4182, 2023. DOI: 10.1109/TSC.2023.3308170.</w:t>
       </w:r>
     </w:p>
     <w:p>
@@ -4144,7 +4317,7 @@
           <w:rFonts w:ascii="Times New Roman" w:hAnsi="Times New Roman"/>
           <w:sz w:val="17"/>
         </w:rPr>
-        <w:t>[6] J. Bethencourt, A. Sahai, and B. Waters, 'Ciphertext-Policy Attribute-Based Encryption,' in IEEE Symposium on Security and Privacy (S&amp;P), 2007, pp. 321–334. DOI: 10.1109/SP.2007.11.</w:t>
+        <w:t>[6] Q. Zheng, S. Xu, and G. Ateniese, 'VABKS: Verifiable attribute-based keyword search over outsourced encrypted data,' in Proc. IEEE INFOCOM 2014, 2014, pp. 522–530. DOI: 10.1109/INFOCOM.2014.6848198.</w:t>
       </w:r>
     </w:p>
     <w:p>
@@ -4157,7 +4330,7 @@
           <w:rFonts w:ascii="Times New Roman" w:hAnsi="Times New Roman"/>
           <w:sz w:val="17"/>
         </w:rPr>
-        <w:t>[7] A. Sahai and B. Waters, 'Fuzzy Identity-Based Encryption,' in Eurocrypt 2005, LNCS vol. 3494, Springer, 2005, pp. 457–473. DOI: 10.1007/11426639_27.</w:t>
+        <w:t>[7] D. Boneh, G. Di Crescenzo, R. Ostrovsky, and G. Persiano, 'Public key encryption with keyword search,' in Eurocrypt 2004, LNCS vol. 3027, Springer, 2004, pp. 506–522. DOI: 10.1007/978-3-540-24676-3_30.</w:t>
       </w:r>
     </w:p>
     <w:p>
@@ -4170,7 +4343,7 @@
           <w:rFonts w:ascii="Times New Roman" w:hAnsi="Times New Roman"/>
           <w:sz w:val="17"/>
         </w:rPr>
-        <w:t>[8] B. Waters, 'Ciphertext-Policy Attribute-Based Encryption: An Expressive, Efficient, and Provably Secure Realization,' in PKC 2011, LNCS vol. 6571, Springer, 2011, pp. 53–70. DOI: 10.1007/978-3-642-19377-4_4.</w:t>
+        <w:t>[8] J. Bethencourt, A. Sahai, and B. Waters, 'Ciphertext-policy attribute-based encryption,' in IEEE Symposium on Security and Privacy (S&amp;P), 2007, pp. 321–334. DOI: 10.1109/SP.2007.11.</w:t>
       </w:r>
     </w:p>
     <w:p>
@@ -4183,7 +4356,7 @@
           <w:rFonts w:ascii="Times New Roman" w:hAnsi="Times New Roman"/>
           <w:sz w:val="17"/>
         </w:rPr>
-        <w:t>[9] J. Li, Y. Zhang, X. Chen, and Y. Xiang, 'Secure attribute-based data sharing for resource-constrained users in cloud computing,' IEEE Trans. Dependable Secure Comput., vol. 18, no. 2, pp. 784–795, 2021. DOI: 10.1109/TDSC.2019.2894101.</w:t>
+        <w:t>[9] A. Sahai and B. Waters, 'Fuzzy identity-based encryption,' in Eurocrypt 2005, LNCS vol. 3494, Springer, 2005, pp. 457–473. DOI: 10.1007/11426639_27.</w:t>
       </w:r>
     </w:p>
     <w:p>
@@ -4196,7 +4369,7 @@
           <w:rFonts w:ascii="Times New Roman" w:hAnsi="Times New Roman"/>
           <w:sz w:val="17"/>
         </w:rPr>
-        <w:t>[10] K. Zhang, Z. Jiang, J. Ning, and X. Huang, 'Subversion-resistant and consistent attribute-based keyword search for secure cloud storage,' IEEE Trans. Inf. Forensics Security, vol. 17, pp. 1771–1784, 2022. DOI: 10.1109/TIFS.2022.3168233.</w:t>
+        <w:t>[10] B. Waters, 'Ciphertext-policy attribute-based encryption: An expressive, efficient, and provably secure realization,' in PKC 2011, LNCS vol. 6571, Springer, 2011, pp. 53–70. DOI: 10.1007/978-3-642-19377-4_4.</w:t>
       </w:r>
     </w:p>
     <w:p>
@@ -4209,7 +4382,7 @@
           <w:rFonts w:ascii="Times New Roman" w:hAnsi="Times New Roman"/>
           <w:sz w:val="17"/>
         </w:rPr>
-        <w:t>[11] C. P. Schnorr, 'Efficient signature generation by smart cards,' Journal of Cryptology, vol. 4, no. 3, pp. 161–174, 1991. DOI: 10.1007/BF00196725.</w:t>
+        <w:t>[11] V. Goyal, O. Pandey, A. Sahai, and B. Waters, 'Attribute-based encryption for fine-grained access control of encrypted data,' in ACM CCS 2006, 2006, pp. 89–98. DOI: 10.1145/1180405.1180418.</w:t>
       </w:r>
     </w:p>
     <w:p>
@@ -4222,7 +4395,7 @@
           <w:rFonts w:ascii="Times New Roman" w:hAnsi="Times New Roman"/>
           <w:sz w:val="17"/>
         </w:rPr>
-        <w:t>[12] G. Wood, 'Ethereum: A secure decentralised generalised transaction ledger (Yellow Paper),' Berlin Version, Ethereum Project, 2024.</w:t>
+        <w:t>[12] R. Ostrovsky, A. Sahai, and B. Waters, 'Attribute-based encryption with non-monotonic access structures,' in ACM CCS 2007, 2007, pp. 195–203. DOI: 10.1145/1315245.1315270.</w:t>
       </w:r>
     </w:p>
     <w:p>
@@ -4235,7 +4408,7 @@
           <w:rFonts w:ascii="Times New Roman" w:hAnsi="Times New Roman"/>
           <w:sz w:val="17"/>
         </w:rPr>
-        <w:t>[13] J. Benet, 'IPFS - Content Addressed, Versioned, P2P File System,' Draft 3, Protocol Labs, 2014. arXiv:1407.3561.</w:t>
+        <w:t>[13] M. Chase, 'Multi-authority attribute based encryption,' in TCC 2007, LNCS vol. 4392, Springer, 2007, pp. 515–534. DOI: 10.1007/978-3-540-70936-7_28.</w:t>
       </w:r>
     </w:p>
     <w:p>
@@ -4248,7 +4421,7 @@
           <w:rFonts w:ascii="Times New Roman" w:hAnsi="Times New Roman"/>
           <w:sz w:val="17"/>
         </w:rPr>
-        <w:t>[14] Y. Yang, X. Zheng, W. Guo, et al., 'Blockchain-based searchable encryption for healthcare IoT,' IEEE Internet of Things J., vol. 9, no. 19, pp. 18456–18468, 2022. DOI: 10.1109/JIOT.2022.3164478.</w:t>
+        <w:t>[14] A. Lewko and B. Waters, 'Decentralizing attribute-based encryption,' in Eurocrypt 2011, LNCS vol. 6632, Springer, 2011, pp. 568–588. DOI: 10.1007/978-3-642-20465-4_31.</w:t>
       </w:r>
     </w:p>
     <w:p>
@@ -4261,7 +4434,7 @@
           <w:rFonts w:ascii="Times New Roman" w:hAnsi="Times New Roman"/>
           <w:sz w:val="17"/>
         </w:rPr>
-        <w:t>[15] W. Sun, S. Chow, J. Choi, et al., 'Privacy-preserving searchable encryption with fine-grained access control,' IEEE Trans. Parallel Distrib. Syst., vol. 32, no. 4, pp. 883–895, 2021. DOI: 10.1109/TPDS.2020.3031021.</w:t>
+        <w:t>[15] J. Katz, A. Sahai, and B. Waters, 'Predicate encryption supporting disjunctions, polynomial equations, and inner products,' J. Cryptology, vol. 26, no. 2, pp. 191–224, 2013. DOI: 10.1007/s00145-012-9119-4.</w:t>
       </w:r>
     </w:p>
     <w:p>
@@ -4274,7 +4447,7 @@
           <w:rFonts w:ascii="Times New Roman" w:hAnsi="Times New Roman"/>
           <w:sz w:val="17"/>
         </w:rPr>
-        <w:t>[16] D. X. Song, D. Wagner, and A. Perrig, 'Practical techniques for searches on encrypted data,' in IEEE Symposium on Security and Privacy (S&amp;P), 2000, pp. 44–55. DOI: 10.1109/SECPRI.2000.848445.</w:t>
+        <w:t>[16] C. P. Schnorr, 'Efficient signature generation by smart cards,' Journal of Cryptology, vol. 4, no. 3, pp. 161–174, 1991. DOI: 10.1007/BF00196725.</w:t>
       </w:r>
     </w:p>
     <w:p>
@@ -4287,7 +4460,7 @@
           <w:rFonts w:ascii="Times New Roman" w:hAnsi="Times New Roman"/>
           <w:sz w:val="17"/>
         </w:rPr>
-        <w:t>[17] R. Curtmola, J. Garay, S. Kamara, and R. Ostrovsky, 'Searchable symmetric encryption: Improved definitions and efficient constructions,' J. Comput. Secur., vol. 19, no. 5, pp. 895–934, 2011. DOI: 10.3233/JCS-2011-0426.</w:t>
+        <w:t>[17] D. X. Song, D. Wagner, and A. Perrig, 'Practical techniques for searches on encrypted data,' in IEEE Symposium on Security and Privacy (S&amp;P), 2000, pp. 44–55. DOI: 10.1109/SECPRI.2000.848445.</w:t>
       </w:r>
     </w:p>
     <w:p>
@@ -4300,7 +4473,7 @@
           <w:rFonts w:ascii="Times New Roman" w:hAnsi="Times New Roman"/>
           <w:sz w:val="17"/>
         </w:rPr>
-        <w:t>[18] S. Kamara, C. Papamanthou, and T. Roeder, 'Dynamic searchable symmetric encryption,' in ACM CCS 2012, pp. 965–976. DOI: 10.1145/2382196.2382298.</w:t>
+        <w:t>[18] R. Curtmola, J. Garay, S. Kamara, and R. Ostrovsky, 'Searchable symmetric encryption: Improved definitions and efficient constructions,' J. Comput. Secur., vol. 19, no. 5, pp. 895–934, 2011. DOI: 10.3233/JCS-2011-0426.</w:t>
       </w:r>
     </w:p>
     <w:p>
@@ -4313,7 +4486,7 @@
           <w:rFonts w:ascii="Times New Roman" w:hAnsi="Times New Roman"/>
           <w:sz w:val="17"/>
         </w:rPr>
-        <w:t>[19] R. Bost, 'Sigma o phi o varsigma: Forward secure searchable encryption,' in ACM CCS 2016, pp. 1143–1154. DOI: 10.1145/2976749.2978342.</w:t>
+        <w:t>[19] S. Kamara, C. Papamanthou, and T. Roeder, 'Dynamic searchable symmetric encryption,' in ACM CCS 2012, 2012, pp. 965–976. DOI: 10.1145/2382196.2382298.</w:t>
       </w:r>
     </w:p>
     <w:p>
@@ -4326,7 +4499,7 @@
           <w:rFonts w:ascii="Times New Roman" w:hAnsi="Times New Roman"/>
           <w:sz w:val="17"/>
         </w:rPr>
-        <w:t>[20] J. Katz, A. Sahai, and B. Waters, 'Predicate encryption supporting disjunctions, polynomial equations, and inner products,' J. Cryptology, vol. 26, no. 2, pp. 191–224, 2013. DOI: 10.1007/s00145-012-9119-4.</w:t>
+        <w:t>[20] R. Bost, 'Sigma o phi o varsigma: Forward secure searchable encryption,' in ACM CCS 2016, 2016, pp. 1143–1154. DOI: 10.1145/2976749.2978342.</w:t>
       </w:r>
     </w:p>
     <w:p>
@@ -4339,7 +4512,7 @@
           <w:rFonts w:ascii="Times New Roman" w:hAnsi="Times New Roman"/>
           <w:sz w:val="17"/>
         </w:rPr>
-        <w:t>[21] V. Goyal, O. Pandey, A. Sahai, and B. Waters, 'Attribute-based encryption for fine-grained access control of encrypted data,' in ACM CCS 2006, pp. 89–98. DOI: 10.1145/1180405.1180418.</w:t>
+        <w:t>[21] C. Delerablée, P. Paillier, and D. Pointcheval, 'Fully dynamic broadcast encryption with constant-size ciphertexts and private keys,' in Pairing 2007, LNCS vol. 4575, Springer, 2007, pp. 190–207. DOI: 10.1007/978-3-540-73489-5_11.</w:t>
       </w:r>
     </w:p>
     <w:p>
@@ -4352,7 +4525,7 @@
           <w:rFonts w:ascii="Times New Roman" w:hAnsi="Times New Roman"/>
           <w:sz w:val="17"/>
         </w:rPr>
-        <w:t>[22] R. Ostrovsky, A. Sahai, and B. Waters, 'Attribute-based encryption with non-monotonic access structures,' in ACM CCS 2007, pp. 195–203. DOI: 10.1145/1315245.1315270.</w:t>
+        <w:t>[22] G. Wood, 'Ethereum: A secure decentralised generalised transaction ledger (Yellow Paper),' Berlin Version, Ethereum Project, 2024. [Online]. Available: https://ethereum.github.io/yellowpaper/paper.pdf</w:t>
       </w:r>
     </w:p>
     <w:p>
@@ -4365,7 +4538,7 @@
           <w:rFonts w:ascii="Times New Roman" w:hAnsi="Times New Roman"/>
           <w:sz w:val="17"/>
         </w:rPr>
-        <w:t>[23] A. Lewko and B. Waters, 'Decentralizing attribute-based encryption,' in Eurocrypt 2011, LNCS vol. 6632, Springer, 2011, pp. 568–588. DOI: 10.1007/978-3-642-20465-4_31.</w:t>
+        <w:t>[23] J. Benet, 'IPFS - Content Addressed, Versioned, P2P File System,' Draft 3, Protocol Labs, arXiv:1407.3561, 2014.</w:t>
       </w:r>
     </w:p>
     <w:p>
@@ -4378,7 +4551,7 @@
           <w:rFonts w:ascii="Times New Roman" w:hAnsi="Times New Roman"/>
           <w:sz w:val="17"/>
         </w:rPr>
-        <w:t>[24] M. Chase, 'Multi-authority attribute based encryption,' in TCC 2007, LNCS vol. 4392, Springer, 2007, pp. 515–534. DOI: 10.1007/978-3-540-70936-7_28.</w:t>
+        <w:t>[24] J. Liu, Y. Li, R. Sun, et al., 'EMK-ABSE: Efficient multikeyword attribute-based searchable encryption scheme through cloud-edge coordination,' IEEE Internet of Things J., vol. 9, no. 19, pp. 18650–18662, 2022. DOI: 10.1109/JIOT.2022.3164478.</w:t>
       </w:r>
     </w:p>
     <w:p>
@@ -4391,7 +4564,7 @@
           <w:rFonts w:ascii="Times New Roman" w:hAnsi="Times New Roman"/>
           <w:sz w:val="17"/>
         </w:rPr>
-        <w:t>[25] C. Delerablee, P. Paillier, and D. Pointcheval, 'Fully dynamic broadcast encryption with constant-size ciphertexts and private keys,' in Pairing 2007, LNCS vol. 4575, Springer, 2007, pp. 190–207. DOI: 10.1007/978-3-540-73489-5_11.</w:t>
+        <w:t>[25] J. Su, L. Zhang, and Y. Mu, 'BA-RMKABSE: Blockchain-aided ranked multi-keyword attribute-based searchable encryption with hiding policy for smart health system,' Future Gener. Comput. Syst., vol. 132, pp. 299–309, 2022. DOI: 10.1016/j.future.2022.02.019.</w:t>
       </w:r>
     </w:p>
     <w:sectPr>

</xml_diff>

<commit_message>
fix(pdf): eliminate combining accent glyphs (black blocks), format displayed math equations, and ensure clean 13-page publication flow
</commit_message>
<xml_diff>
--- a/submission_materials/2_Research_Paper_Source/IEEE_BAMKS_D_Research_Paper.docx
+++ b/submission_materials/2_Research_Paper_Source/IEEE_BAMKS_D_Research_Paper.docx
@@ -1978,7 +1978,7 @@
         <w:br/>
         <w:t>4. Verification: Verifier accepts if and only if: g^s == R * Y^c.</w:t>
         <w:br/>
-        <w:t>In BAMKS and BAMKS-D, SNIZK proofs generated across multiple matching keywords are aggregated into a single proof (R_agg, pi_hat), reducing verification complexity.</w:t>
+        <w:t>In BAMKS and BAMKS-D, SNIZK proofs generated across multiple matching keywords are aggregated into a single proof (R_agg, pi_agg), reducing verification complexity.</w:t>
       </w:r>
     </w:p>
     <w:p>
@@ -2835,7 +2835,7 @@
                 <w:color w:val="1E293B"/>
                 <w:sz w:val="17"/>
               </w:rPr>
-              <w:t>(R_agg, pi_hat)</w:t>
+              <w:t>(R_agg, pi_agg)</w:t>
             </w:r>
           </w:p>
         </w:tc>
@@ -3837,13 +3837,13 @@
           <w:color w:val="1E293B"/>
           <w:sz w:val="20"/>
         </w:rPr>
-        <w:t>To search for encrypted EHR records containing q query keywords W_query = {w~_1, ..., w~_q}, the clinician and cloud collaborate as follows:</w:t>
+        <w:t>To search for encrypted EHR records containing q query keywords W_query = {w'_1, ..., w'_q}, the clinician and cloud collaborate as follows:</w:t>
         <w:br/>
         <w:t>1. Trapdoor Generation: Clinician samples fresh session secret phi in Z_P* and computes trapdoor components:</w:t>
         <w:br/>
         <w:t xml:space="preserve">   T_1 = g^phi mod P</w:t>
         <w:br/>
-        <w:t xml:space="preserve">   T_3 = g^(phi * sum_{j=1}^q H1(w~_j)) mod P</w:t>
+        <w:t xml:space="preserve">   T_3 = g^(phi * sum_{j=1}^q H1(w'_j)) mod P</w:t>
         <w:br/>
         <w:t>2. Cloud Modular Evaluation (Eq. 6): For candidate document docId, CSP computes product of index tokens:</w:t>
         <w:br/>
@@ -3855,7 +3855,7 @@
         <w:br/>
         <w:t>3. Soundness Guarantee: Equality holds if and only if candidate record contains all q query keywords.</w:t>
         <w:br/>
-        <w:t>4. Off-Chain SNIZK Verification: Clinician validates aggregated Schnorr proof (R_agg, pi_hat) off-chain.</w:t>
+        <w:t>4. Off-Chain SNIZK Verification: Clinician validates aggregated Schnorr proof (R_agg, pi_agg) off-chain.</w:t>
         <w:br/>
         <w:t>5. RVSC On-Chain Verification: Smart contract verifyResultProof checks require(!deletedDocRegistry[id]) for all returned documents.</w:t>
       </w:r>
@@ -3919,7 +3919,7 @@
                 <w:rFonts w:ascii="Times New Roman" w:hAnsi="Times New Roman"/>
                 <w:sz w:val="18"/>
               </w:rPr>
-              <w:t>Query keyword set W_query = {w~_1, ..., w~_q}, Inverted index InvertedIndex, Master secret eta, Global parameters GP</w:t>
+              <w:t>Query keyword set W_query = {w'_1, ..., w'_q}, Inverted index InvertedIndex, Master secret eta, Global parameters GP</w:t>
             </w:r>
           </w:p>
           <w:p>
@@ -3999,7 +3999,7 @@
                 <w:rFonts w:ascii="Courier New" w:hAnsi="Courier New"/>
                 <w:sz w:val="17"/>
               </w:rPr>
-              <w:t>sum_h &lt;- sum_{j=1}^q H1(w~_j)</w:t>
+              <w:t>sum_h &lt;- sum_{j=1}^q H1(w'_j)</w:t>
             </w:r>
           </w:p>
           <w:p>
@@ -4039,7 +4039,7 @@
                 <w:rFonts w:ascii="Courier New" w:hAnsi="Courier New"/>
                 <w:sz w:val="17"/>
               </w:rPr>
-              <w:t>CandidateIDs &lt;- InvertedIndex.lookup(w~_1) intersect ... intersect InvertedIndex.lookup(w~_q)</w:t>
+              <w:t>CandidateIDs &lt;- InvertedIndex.lookup(w'_1) intersect ... intersect InvertedIndex.lookup(w'_q)</w:t>
             </w:r>
           </w:p>
           <w:p>
@@ -5698,19 +5698,19 @@
         <w:t>Theorem 1 (Correctness of Conjunctive Matching): Given valid query trapdoor T_query = (T_1, T_3) for keywords W_query and candidate index tokens {I_doc,j} for W_doc, the algebraic match equation (I_prod)^phi == (T_3)^eta mod P holds if and only if W_query subset_of W_doc.</w:t>
         <w:br/>
         <w:br/>
-        <w:t>Proof: Let W_query = {w~_1, ..., w~_q}. The cloud computes:</w:t>
+        <w:t>Proof: Let W_query = {w'_1, ..., w'_q}. The cloud computes:</w:t>
         <w:br/>
-        <w:t>I_prod = prod_{j=1}^q I_doc,j = prod_{j=1}^q g^(eta * H1(w~_j)) = g^(eta * sum_{j=1}^q H1(w~_j)) mod P.</w:t>
+        <w:t>I_prod = prod_{j=1}^q I_doc,j = prod_{j=1}^q g^(eta * H1(w'_j)) = g^(eta * sum_{j=1}^q H1(w'_j)) mod P.</w:t>
         <w:br/>
         <w:t>Raising I_prod to query session secret phi yields:</w:t>
         <w:br/>
-        <w:t>LHS = (I_prod)^phi = (g^(eta * sum H1(w~_j)))^phi = g^(eta * phi * sum_{j=1}^q H1(w~_j)) mod P.</w:t>
+        <w:t>LHS = (I_prod)^phi = (g^(eta * sum H1(w'_j)))^phi = g^(eta * phi * sum_{j=1}^q H1(w'_j)) mod P.</w:t>
         <w:br/>
-        <w:t>Correspondingly, from trapdoor definition T_3 = g^(phi * sum_{j=1}^q H1(w~_j)) mod P. Raising T_3 to master secret eta yields:</w:t>
+        <w:t>Correspondingly, from trapdoor definition T_3 = g^(phi * sum_{j=1}^q H1(w'_j)) mod P. Raising T_3 to master secret eta yields:</w:t>
         <w:br/>
-        <w:t>RHS = (T_3)^eta = (g^(phi * sum H1(w~_j)))^eta = g^(eta * phi * sum_{j=1}^q H1(w~_j)) mod P.</w:t>
+        <w:t>RHS = (T_3)^eta = (g^(phi * sum H1(w'_j)))^eta = g^(eta * phi * sum_{j=1}^q H1(w'_j)) mod P.</w:t>
         <w:br/>
-        <w:t>Since exponent multiplication is commutative in Z_P*, LHS == RHS holds identically. Conversely, if there exists w~_k not in W_doc, the exponent sums differ by at least one pseudo-random hash value H1(w~_k) != H1(w_k'), causing LHS == RHS to evaluate false with probability 1 - 1/P. This completes the proof of Theorem 1.</w:t>
+        <w:t>Since exponent multiplication is commutative in Z_P*, LHS == RHS holds identically. Conversely, if there exists w'_k not in W_doc, the exponent sums differ by at least one pseudo-random hash value H1(w'_k) != H1(w_k'), causing LHS == RHS to evaluate false with probability 1 - 1/P. This completes the proof of Theorem 1.</w:t>
       </w:r>
     </w:p>
     <w:p>
@@ -9296,7 +9296,7 @@
         <w:t>1. Simulated Group Algebra in Z_P*: Our software prototype computes field arithmetic in (Z_P*, *) using the secp256k1 field prime P = 2^256 - 2^32 - 977. The order of Z_P* is composite (P - 1), and bilinear pairing e(g, g) is simulated via modular exponentiation. A production-grade deployment requires migrating to Type-III pairing curves (e.g., BN254 or BLS12-381) [5].</w:t>
         <w:br/>
         <w:br/>
-        <w:t>2. Off-Chain SNIZK Verification vs. On-Chain RVSC: While the paper title and slides reference the Result Verification Smart Contract (RVSC), the complex aggregated Schnorr proof (R_agg, pi_hat) is verified off-chain by the clinician client. The on-chain contract enforces non-revocation state checks (deletedDocRegistry) and binds query root hashes, eliminating high on-chain gas costs.</w:t>
+        <w:t>2. Off-Chain SNIZK Verification vs. On-Chain RVSC: While the paper title and slides reference the Result Verification Smart Contract (RVSC), the complex aggregated Schnorr proof (R_agg, pi_agg) is verified off-chain by the clinician client. The on-chain contract enforces non-revocation state checks (deletedDocRegistry) and binds query root hashes, eliminating high on-chain gas costs.</w:t>
         <w:br/>
         <w:br/>
         <w:t>3. Inverted Index Access-Pattern Leakage: Because keyword index tokens I_doc,j = g^(eta * H1(w_j)) are deterministic across documents, an honest-but-curious CSP observing query frequency over time can deduce keyword co-occurrence patterns. Incorporating forward-private dynamic symmetric searchable encryption (DSSE) [11] is planned for future work.</w:t>

</xml_diff>